<commit_message>
Nettoyage du CV - suppression des sous-catégories inutiles
Co-authored-by: Curtis736 <Curtis736@users.noreply.github.com>
</commit_message>
<xml_diff>
--- a/CV_Curtis_Robert_CELAD.docx
+++ b/CV_Curtis_Robert_CELAD.docx
@@ -25,101 +25,6 @@
         </w:rPr>
       </w:pPr>
     </w:p>
-    <w:tbl>
-      <w:tblPr>
-        <w:tblStyle w:val="Grilledutableau"/>
-        <w:tblW w:w="0" w:type="auto"/>
-        <w:tblBorders>
-          <w:top w:val="none" w:sz="0" w:space="0" w:color="auto"/>
-          <w:left w:val="none" w:sz="0" w:space="0" w:color="auto"/>
-          <w:bottom w:val="none" w:sz="0" w:space="0" w:color="auto"/>
-          <w:right w:val="none" w:sz="0" w:space="0" w:color="auto"/>
-          <w:insideH w:val="none" w:sz="0" w:space="0" w:color="auto"/>
-          <w:insideV w:val="none" w:sz="0" w:space="0" w:color="auto"/>
-        </w:tblBorders>
-        <w:tblLook w:val="04A0" w:firstRow="1" w:lastRow="0" w:firstColumn="1" w:lastColumn="0" w:noHBand="0" w:noVBand="1"/>
-      </w:tblPr>
-      <w:tblGrid>
-        <w:gridCol w:w="3709"/>
-        <w:gridCol w:w="3108"/>
-        <w:gridCol w:w="3649"/>
-      </w:tblGrid>
-      <w:tr>
-        <w:tc>
-          <w:tcPr>
-            <w:tcW w:w="3709" w:type="dxa"/>
-          </w:tcPr>
-          <w:p>
-            <w:pPr>
-              <w:rPr>
-                <w:rFonts w:asciiTheme="majorHAnsi" w:hAnsiTheme="majorHAnsi"/>
-                <w:sz w:val="36"/>
-                <w:szCs w:val="36"/>
-              </w:rPr>
-            </w:pPr>
-            <w:r>
-              <w:rPr>
-                <w:rFonts w:ascii="Graphik Regular" w:hAnsi="Graphik Regular"/>
-                <w:color w:val="1D1E3C" w:themeColor="text2"/>
-                <w:sz w:val="40"/>
-                <w:szCs w:val="40"/>
-              </w:rPr>
-              <w:t xml:space="preserve">NOM </w:t>
-            </w:r>
-            <w:r>
-              <w:rPr>
-                <w:rFonts w:asciiTheme="majorHAnsi" w:hAnsiTheme="majorHAnsi"/>
-                <w:color w:val="952866" w:themeColor="accent2"/>
-                <w:sz w:val="40"/>
-                <w:szCs w:val="40"/>
-              </w:rPr>
-              <w:t>Prénom</w:t>
-            </w:r>
-          </w:p>
-        </w:tc>
-        <w:tc>
-          <w:tcPr>
-            <w:tcW w:w="3108" w:type="dxa"/>
-          </w:tcPr>
-          <w:p>
-            <w:pPr>
-              <w:jc w:val="center"/>
-              <w:rPr>
-                <w:rFonts w:asciiTheme="majorHAnsi" w:hAnsiTheme="majorHAnsi"/>
-                <w:color w:val="1D1E3C" w:themeColor="text1"/>
-                <w:sz w:val="32"/>
-                <w:szCs w:val="32"/>
-              </w:rPr>
-            </w:pPr>
-          </w:p>
-        </w:tc>
-        <w:tc>
-          <w:tcPr>
-            <w:tcW w:w="3649" w:type="dxa"/>
-          </w:tcPr>
-          <w:p>
-            <w:pPr>
-              <w:jc w:val="right"/>
-              <w:rPr>
-                <w:rFonts w:asciiTheme="majorHAnsi" w:hAnsiTheme="majorHAnsi"/>
-                <w:color w:val="3750BE" w:themeColor="accent1"/>
-                <w:sz w:val="36"/>
-                <w:szCs w:val="36"/>
-              </w:rPr>
-            </w:pPr>
-            <w:r>
-              <w:rPr>
-                <w:rFonts w:asciiTheme="majorHAnsi" w:hAnsiTheme="majorHAnsi"/>
-                <w:color w:val="3750BE" w:themeColor="accent1"/>
-                <w:sz w:val="32"/>
-                <w:szCs w:val="32"/>
-              </w:rPr>
-              <w:t>Titre et/ou Fonction</w:t>
-            </w:r>
-          </w:p>
-        </w:tc>
-      </w:tr>
-    </w:tbl>
     <w:p>
       <w:pPr>
         <w:rPr>
@@ -327,7 +232,6 @@
       <w:r>
         <w:rPr>
           <w:rFonts w:ascii="Calibri" w:hAnsi="Calibri"/>
-          <w:color w:val="000000"/>
           <w:sz w:val="22"/>
         </w:rPr>
         <w:t>Infrastructure &amp; Cloud : Docker, Linux, AWS, Kubernetes, Azure</w:t>
@@ -347,403 +251,6 @@
         <w:t>Outils : SonarQube, HashiCorp Vault, Nginx, SQL Server</w:t>
       </w:r>
     </w:p>
-    <w:tbl>
-      <w:tblPr>
-        <w:tblStyle w:val="Grilledutableau"/>
-        <w:tblW w:w="0" w:type="auto"/>
-        <w:tblLook w:val="04A0" w:firstRow="1" w:lastRow="0" w:firstColumn="1" w:lastColumn="0" w:noHBand="0" w:noVBand="1"/>
-      </w:tblPr>
-      <w:tblGrid>
-        <w:gridCol w:w="2943"/>
-        <w:gridCol w:w="6269"/>
-      </w:tblGrid>
-      <w:tr>
-        <w:trPr>
-          <w:trHeight w:val="680"/>
-        </w:trPr>
-        <w:tc>
-          <w:tcPr>
-            <w:tcW w:w="2943" w:type="dxa"/>
-            <w:tcBorders>
-              <w:top w:val="nil"/>
-              <w:left w:val="nil"/>
-              <w:bottom w:val="nil"/>
-              <w:right w:val="nil"/>
-            </w:tcBorders>
-          </w:tcPr>
-          <w:p>
-            <w:pPr>
-              <w:rPr>
-                <w:rFonts w:ascii="Roboto Light" w:hAnsi="Roboto Light"/>
-                <w:color w:val="3750BE" w:themeColor="accent1"/>
-                <w:sz w:val="24"/>
-                <w:szCs w:val="24"/>
-              </w:rPr>
-            </w:pPr>
-            <w:r>
-              <w:rPr>
-                <w:rFonts w:ascii="Roboto Light" w:hAnsi="Roboto Light"/>
-                <w:color w:val="3750BE" w:themeColor="accent1"/>
-                <w:sz w:val="24"/>
-                <w:szCs w:val="24"/>
-              </w:rPr>
-              <w:t>Systèmes</w:t>
-            </w:r>
-          </w:p>
-          <w:p>
-            <w:pPr>
-              <w:rPr>
-                <w:rFonts w:ascii="Roboto Light" w:hAnsi="Roboto Light"/>
-                <w:color w:val="3750BE" w:themeColor="accent1"/>
-                <w:sz w:val="24"/>
-                <w:szCs w:val="24"/>
-              </w:rPr>
-            </w:pPr>
-          </w:p>
-        </w:tc>
-        <w:tc>
-          <w:tcPr>
-            <w:tcW w:w="6269" w:type="dxa"/>
-            <w:tcBorders>
-              <w:top w:val="nil"/>
-              <w:left w:val="nil"/>
-              <w:bottom w:val="nil"/>
-              <w:right w:val="nil"/>
-            </w:tcBorders>
-          </w:tcPr>
-          <w:p/>
-        </w:tc>
-      </w:tr>
-      <w:tr>
-        <w:trPr>
-          <w:trHeight w:val="680"/>
-        </w:trPr>
-        <w:tc>
-          <w:tcPr>
-            <w:tcW w:w="2943" w:type="dxa"/>
-            <w:tcBorders>
-              <w:top w:val="nil"/>
-              <w:left w:val="nil"/>
-              <w:bottom w:val="nil"/>
-              <w:right w:val="nil"/>
-            </w:tcBorders>
-          </w:tcPr>
-          <w:p>
-            <w:pPr>
-              <w:rPr>
-                <w:rFonts w:ascii="Roboto Light" w:hAnsi="Roboto Light"/>
-                <w:color w:val="3750BE" w:themeColor="accent1"/>
-                <w:sz w:val="24"/>
-                <w:szCs w:val="24"/>
-              </w:rPr>
-            </w:pPr>
-            <w:r>
-              <w:rPr>
-                <w:rFonts w:ascii="Roboto Light" w:hAnsi="Roboto Light"/>
-                <w:color w:val="3750BE" w:themeColor="accent1"/>
-                <w:sz w:val="24"/>
-                <w:szCs w:val="24"/>
-              </w:rPr>
-              <w:t>Matériels</w:t>
-            </w:r>
-          </w:p>
-        </w:tc>
-        <w:tc>
-          <w:tcPr>
-            <w:tcW w:w="6269" w:type="dxa"/>
-            <w:tcBorders>
-              <w:top w:val="nil"/>
-              <w:left w:val="nil"/>
-              <w:bottom w:val="nil"/>
-              <w:right w:val="nil"/>
-            </w:tcBorders>
-          </w:tcPr>
-          <w:p/>
-        </w:tc>
-      </w:tr>
-      <w:tr>
-        <w:trPr>
-          <w:trHeight w:val="680"/>
-        </w:trPr>
-        <w:tc>
-          <w:tcPr>
-            <w:tcW w:w="2943" w:type="dxa"/>
-            <w:tcBorders>
-              <w:top w:val="nil"/>
-              <w:left w:val="nil"/>
-              <w:bottom w:val="nil"/>
-              <w:right w:val="nil"/>
-            </w:tcBorders>
-          </w:tcPr>
-          <w:p>
-            <w:pPr>
-              <w:rPr>
-                <w:rFonts w:ascii="Roboto Light" w:hAnsi="Roboto Light"/>
-                <w:color w:val="3750BE" w:themeColor="accent1"/>
-                <w:sz w:val="24"/>
-                <w:szCs w:val="24"/>
-              </w:rPr>
-            </w:pPr>
-            <w:r>
-              <w:rPr>
-                <w:rFonts w:ascii="Roboto Light" w:hAnsi="Roboto Light"/>
-                <w:color w:val="3750BE" w:themeColor="accent1"/>
-                <w:sz w:val="24"/>
-                <w:szCs w:val="24"/>
-              </w:rPr>
-              <w:t>Langages</w:t>
-            </w:r>
-          </w:p>
-        </w:tc>
-        <w:tc>
-          <w:tcPr>
-            <w:tcW w:w="6269" w:type="dxa"/>
-            <w:tcBorders>
-              <w:top w:val="nil"/>
-              <w:left w:val="nil"/>
-              <w:bottom w:val="nil"/>
-              <w:right w:val="nil"/>
-            </w:tcBorders>
-          </w:tcPr>
-          <w:p/>
-        </w:tc>
-      </w:tr>
-      <w:tr>
-        <w:trPr>
-          <w:trHeight w:val="680"/>
-        </w:trPr>
-        <w:tc>
-          <w:tcPr>
-            <w:tcW w:w="2943" w:type="dxa"/>
-            <w:tcBorders>
-              <w:top w:val="nil"/>
-              <w:left w:val="nil"/>
-              <w:bottom w:val="nil"/>
-              <w:right w:val="nil"/>
-            </w:tcBorders>
-          </w:tcPr>
-          <w:p>
-            <w:pPr>
-              <w:rPr>
-                <w:rFonts w:ascii="Roboto Light" w:hAnsi="Roboto Light"/>
-                <w:color w:val="3750BE" w:themeColor="accent1"/>
-                <w:sz w:val="24"/>
-                <w:szCs w:val="24"/>
-              </w:rPr>
-            </w:pPr>
-            <w:r>
-              <w:rPr>
-                <w:rFonts w:ascii="Roboto Light" w:hAnsi="Roboto Light"/>
-                <w:color w:val="3750BE" w:themeColor="accent1"/>
-                <w:sz w:val="24"/>
-                <w:szCs w:val="24"/>
-              </w:rPr>
-              <w:t>Serveurs d’applications</w:t>
-            </w:r>
-          </w:p>
-        </w:tc>
-        <w:tc>
-          <w:tcPr>
-            <w:tcW w:w="6269" w:type="dxa"/>
-            <w:tcBorders>
-              <w:top w:val="nil"/>
-              <w:left w:val="nil"/>
-              <w:bottom w:val="nil"/>
-              <w:right w:val="nil"/>
-            </w:tcBorders>
-          </w:tcPr>
-          <w:p/>
-        </w:tc>
-      </w:tr>
-      <w:tr>
-        <w:trPr>
-          <w:trHeight w:val="680"/>
-        </w:trPr>
-        <w:tc>
-          <w:tcPr>
-            <w:tcW w:w="2943" w:type="dxa"/>
-            <w:tcBorders>
-              <w:top w:val="nil"/>
-              <w:left w:val="nil"/>
-              <w:bottom w:val="nil"/>
-              <w:right w:val="nil"/>
-            </w:tcBorders>
-          </w:tcPr>
-          <w:p>
-            <w:pPr>
-              <w:rPr>
-                <w:rFonts w:ascii="Roboto Light" w:hAnsi="Roboto Light"/>
-                <w:color w:val="3750BE" w:themeColor="accent1"/>
-                <w:sz w:val="24"/>
-                <w:szCs w:val="24"/>
-              </w:rPr>
-            </w:pPr>
-            <w:r>
-              <w:rPr>
-                <w:rFonts w:ascii="Roboto Light" w:hAnsi="Roboto Light"/>
-                <w:color w:val="3750BE" w:themeColor="accent1"/>
-                <w:sz w:val="24"/>
-                <w:szCs w:val="24"/>
-              </w:rPr>
-              <w:t>Base de données</w:t>
-            </w:r>
-          </w:p>
-        </w:tc>
-        <w:tc>
-          <w:tcPr>
-            <w:tcW w:w="6269" w:type="dxa"/>
-            <w:tcBorders>
-              <w:top w:val="nil"/>
-              <w:left w:val="nil"/>
-              <w:bottom w:val="nil"/>
-              <w:right w:val="nil"/>
-            </w:tcBorders>
-          </w:tcPr>
-          <w:p/>
-        </w:tc>
-      </w:tr>
-      <w:tr>
-        <w:trPr>
-          <w:trHeight w:val="680"/>
-        </w:trPr>
-        <w:tc>
-          <w:tcPr>
-            <w:tcW w:w="2943" w:type="dxa"/>
-            <w:tcBorders>
-              <w:top w:val="nil"/>
-              <w:left w:val="nil"/>
-              <w:bottom w:val="nil"/>
-              <w:right w:val="nil"/>
-            </w:tcBorders>
-          </w:tcPr>
-          <w:p>
-            <w:pPr>
-              <w:rPr>
-                <w:rFonts w:ascii="Roboto Light" w:hAnsi="Roboto Light"/>
-                <w:color w:val="3750BE" w:themeColor="accent1"/>
-                <w:sz w:val="24"/>
-                <w:szCs w:val="24"/>
-              </w:rPr>
-            </w:pPr>
-            <w:r>
-              <w:rPr>
-                <w:rFonts w:ascii="Roboto Light" w:hAnsi="Roboto Light"/>
-                <w:color w:val="3750BE" w:themeColor="accent1"/>
-                <w:sz w:val="24"/>
-                <w:szCs w:val="24"/>
-              </w:rPr>
-              <w:t>Méthodologies</w:t>
-            </w:r>
-          </w:p>
-        </w:tc>
-        <w:tc>
-          <w:tcPr>
-            <w:tcW w:w="6269" w:type="dxa"/>
-            <w:tcBorders>
-              <w:top w:val="nil"/>
-              <w:left w:val="nil"/>
-              <w:bottom w:val="nil"/>
-              <w:right w:val="nil"/>
-            </w:tcBorders>
-          </w:tcPr>
-          <w:p/>
-        </w:tc>
-      </w:tr>
-      <w:tr>
-        <w:trPr>
-          <w:trHeight w:val="680"/>
-        </w:trPr>
-        <w:tc>
-          <w:tcPr>
-            <w:tcW w:w="2943" w:type="dxa"/>
-            <w:tcBorders>
-              <w:top w:val="nil"/>
-              <w:left w:val="nil"/>
-              <w:bottom w:val="nil"/>
-              <w:right w:val="nil"/>
-            </w:tcBorders>
-          </w:tcPr>
-          <w:p>
-            <w:pPr>
-              <w:rPr>
-                <w:rFonts w:ascii="Roboto Light" w:hAnsi="Roboto Light"/>
-                <w:color w:val="3750BE" w:themeColor="accent1"/>
-                <w:sz w:val="24"/>
-                <w:szCs w:val="24"/>
-              </w:rPr>
-            </w:pPr>
-            <w:r>
-              <w:rPr>
-                <w:rFonts w:ascii="Roboto Light" w:hAnsi="Roboto Light"/>
-                <w:color w:val="3750BE" w:themeColor="accent1"/>
-                <w:sz w:val="24"/>
-                <w:szCs w:val="24"/>
-              </w:rPr>
-              <w:t>Outils</w:t>
-            </w:r>
-          </w:p>
-        </w:tc>
-        <w:tc>
-          <w:tcPr>
-            <w:tcW w:w="6269" w:type="dxa"/>
-            <w:tcBorders>
-              <w:top w:val="nil"/>
-              <w:left w:val="nil"/>
-              <w:bottom w:val="nil"/>
-              <w:right w:val="nil"/>
-            </w:tcBorders>
-          </w:tcPr>
-          <w:p/>
-        </w:tc>
-      </w:tr>
-      <w:tr>
-        <w:trPr>
-          <w:trHeight w:val="680"/>
-        </w:trPr>
-        <w:tc>
-          <w:tcPr>
-            <w:tcW w:w="2943" w:type="dxa"/>
-            <w:tcBorders>
-              <w:top w:val="nil"/>
-              <w:left w:val="nil"/>
-              <w:bottom w:val="nil"/>
-              <w:right w:val="nil"/>
-            </w:tcBorders>
-          </w:tcPr>
-          <w:p>
-            <w:pPr>
-              <w:rPr>
-                <w:rFonts w:ascii="Roboto Light" w:hAnsi="Roboto Light"/>
-                <w:color w:val="3750BE" w:themeColor="accent1"/>
-                <w:sz w:val="24"/>
-                <w:szCs w:val="24"/>
-              </w:rPr>
-            </w:pPr>
-            <w:r>
-              <w:rPr>
-                <w:rFonts w:ascii="Roboto Light" w:hAnsi="Roboto Light"/>
-                <w:color w:val="3750BE" w:themeColor="accent1"/>
-                <w:sz w:val="24"/>
-                <w:szCs w:val="24"/>
-              </w:rPr>
-              <w:t>Langues</w:t>
-            </w:r>
-          </w:p>
-        </w:tc>
-        <w:tc>
-          <w:tcPr>
-            <w:tcW w:w="6269" w:type="dxa"/>
-            <w:tcBorders>
-              <w:top w:val="nil"/>
-              <w:left w:val="nil"/>
-              <w:bottom w:val="nil"/>
-              <w:right w:val="nil"/>
-            </w:tcBorders>
-          </w:tcPr>
-          <w:p/>
-        </w:tc>
-      </w:tr>
-    </w:tbl>
     <w:p>
       <w:pPr>
         <w:pStyle w:val="Paragraphedeliste"/>

</xml_diff>

<commit_message>
Ajout des certifications AWS et Terraform
Co-authored-by: Curtis736 <Curtis736@users.noreply.github.com>
</commit_message>
<xml_diff>
--- a/CV_Curtis_Robert_CELAD.docx
+++ b/CV_Curtis_Robert_CELAD.docx
@@ -5,6 +5,10 @@
     <w:p>
       <w:pPr>
         <w:jc w:val="center"/>
+        <w:rPr>
+          <w:sz w:val="2"/>
+          <w:szCs w:val="2"/>
+        </w:rPr>
       </w:pPr>
       <w:r>
         <w:rPr>
@@ -16,15 +20,6 @@
         <w:t>Curtis ROBERT</w:t>
       </w:r>
     </w:p>
-    <w:p/>
-    <w:p>
-      <w:pPr>
-        <w:rPr>
-          <w:sz w:val="2"/>
-          <w:szCs w:val="2"/>
-        </w:rPr>
-      </w:pPr>
-    </w:p>
     <w:p>
       <w:pPr>
         <w:rPr>
@@ -33,6 +28,7 @@
           <w:szCs w:val="6"/>
         </w:rPr>
       </w:pPr>
+      <w:r/>
     </w:p>
     <w:p>
       <w:pPr>
@@ -44,72 +40,12 @@
       </w:pPr>
       <w:r>
         <w:rPr>
-          <w:noProof/>
+          <w:rFonts w:ascii="Calibri" w:hAnsi="Calibri"/>
+          <w:b/>
+          <w:color w:val="003366"/>
           <w:sz w:val="28"/>
-          <w:szCs w:val="28"/>
-        </w:rPr>
-        <w:drawing>
-          <wp:anchor distT="0" distB="0" distL="114300" distR="114300" simplePos="0" relativeHeight="251686400" behindDoc="0" locked="0" layoutInCell="1" allowOverlap="1" wp14:anchorId="2AF53F27" wp14:editId="4DDD693C">
-            <wp:simplePos x="0" y="0"/>
-            <wp:positionH relativeFrom="margin">
-              <wp:posOffset>6022975</wp:posOffset>
-            </wp:positionH>
-            <wp:positionV relativeFrom="paragraph">
-              <wp:posOffset>273050</wp:posOffset>
-            </wp:positionV>
-            <wp:extent cx="652780" cy="652780"/>
-            <wp:effectExtent l="0" t="0" r="0" b="0"/>
-            <wp:wrapSquare wrapText="bothSides"/>
-            <wp:docPr id="1" name="Image 1"/>
-            <wp:cNvGraphicFramePr>
-              <a:graphicFrameLocks xmlns:a="http://schemas.openxmlformats.org/drawingml/2006/main" noChangeAspect="1"/>
-            </wp:cNvGraphicFramePr>
-            <a:graphic xmlns:a="http://schemas.openxmlformats.org/drawingml/2006/main">
-              <a:graphicData uri="http://schemas.openxmlformats.org/drawingml/2006/picture">
-                <pic:pic xmlns:pic="http://schemas.openxmlformats.org/drawingml/2006/picture">
-                  <pic:nvPicPr>
-                    <pic:cNvPr id="0" name="Picture 3"/>
-                    <pic:cNvPicPr>
-                      <a:picLocks noChangeAspect="1" noChangeArrowheads="1"/>
-                    </pic:cNvPicPr>
-                  </pic:nvPicPr>
-                  <pic:blipFill>
-                    <a:blip r:embed="rId8" cstate="print">
-                      <a:extLst>
-                        <a:ext uri="{28A0092B-C50C-407E-A947-70E740481C1C}">
-                          <a14:useLocalDpi xmlns:a14="http://schemas.microsoft.com/office/drawing/2010/main" val="0"/>
-                        </a:ext>
-                      </a:extLst>
-                    </a:blip>
-                    <a:srcRect/>
-                    <a:stretch>
-                      <a:fillRect/>
-                    </a:stretch>
-                  </pic:blipFill>
-                  <pic:spPr bwMode="auto">
-                    <a:xfrm flipH="1">
-                      <a:off x="0" y="0"/>
-                      <a:ext cx="652780" cy="652780"/>
-                    </a:xfrm>
-                    <a:prstGeom prst="rect">
-                      <a:avLst/>
-                    </a:prstGeom>
-                    <a:noFill/>
-                    <a:ln>
-                      <a:noFill/>
-                    </a:ln>
-                  </pic:spPr>
-                </pic:pic>
-              </a:graphicData>
-            </a:graphic>
-            <wp14:sizeRelH relativeFrom="margin">
-              <wp14:pctWidth>0</wp14:pctWidth>
-            </wp14:sizeRelH>
-            <wp14:sizeRelV relativeFrom="margin">
-              <wp14:pctHeight>0</wp14:pctHeight>
-            </wp14:sizeRelV>
-          </wp:anchor>
-        </w:drawing>
+        </w:rPr>
+        <w:t>CONNAISSANCES TECHNIQUES</w:t>
       </w:r>
     </w:p>
     <w:p>
@@ -118,115 +54,6 @@
           <w:rFonts w:asciiTheme="majorHAnsi" w:hAnsiTheme="majorHAnsi"/>
           <w:sz w:val="18"/>
           <w:szCs w:val="18"/>
-        </w:rPr>
-      </w:pPr>
-    </w:p>
-    <w:p>
-      <w:pPr>
-        <w:pStyle w:val="Paragraphedeliste"/>
-        <w:numPr>
-          <w:ilvl w:val="0"/>
-          <w:numId w:val="24"/>
-        </w:numPr>
-        <w:rPr>
-          <w:rFonts w:asciiTheme="majorHAnsi" w:hAnsiTheme="majorHAnsi"/>
-          <w:color w:val="1D1E3C" w:themeColor="text2"/>
-          <w:sz w:val="32"/>
-          <w:szCs w:val="32"/>
-        </w:rPr>
-      </w:pPr>
-      <w:r>
-        <w:rPr>
-          <w:rFonts w:ascii="Calibri" w:hAnsi="Calibri"/>
-          <w:b/>
-          <w:noProof/>
-          <w:color w:val="003366"/>
-          <w:sz w:val="28"/>
-          <w:szCs w:val="24"/>
-          <w:lang w:eastAsia="fr-FR"/>
-        </w:rPr>
-        <mc:AlternateContent>
-          <mc:Choice Requires="wps">
-            <w:drawing>
-              <wp:anchor distT="0" distB="0" distL="114300" distR="114300" simplePos="0" relativeHeight="251653632" behindDoc="0" locked="0" layoutInCell="1" allowOverlap="1" wp14:anchorId="264E4C89" wp14:editId="5C5F209F">
-                <wp:simplePos x="0" y="0"/>
-                <wp:positionH relativeFrom="column">
-                  <wp:posOffset>0</wp:posOffset>
-                </wp:positionH>
-                <wp:positionV relativeFrom="paragraph">
-                  <wp:posOffset>309517</wp:posOffset>
-                </wp:positionV>
-                <wp:extent cx="6748780" cy="0"/>
-                <wp:effectExtent l="0" t="0" r="0" b="0"/>
-                <wp:wrapNone/>
-                <wp:docPr id="6" name="Connecteur droit 6"/>
-                <wp:cNvGraphicFramePr/>
-                <a:graphic xmlns:a="http://schemas.openxmlformats.org/drawingml/2006/main">
-                  <a:graphicData uri="http://schemas.microsoft.com/office/word/2010/wordprocessingShape">
-                    <wps:wsp>
-                      <wps:cNvCnPr/>
-                      <wps:spPr>
-                        <a:xfrm>
-                          <a:off x="0" y="0"/>
-                          <a:ext cx="6748780" cy="0"/>
-                        </a:xfrm>
-                        <a:prstGeom prst="line">
-                          <a:avLst/>
-                        </a:prstGeom>
-                        <a:ln/>
-                      </wps:spPr>
-                      <wps:style>
-                        <a:lnRef idx="1">
-                          <a:schemeClr val="accent2"/>
-                        </a:lnRef>
-                        <a:fillRef idx="0">
-                          <a:schemeClr val="accent2"/>
-                        </a:fillRef>
-                        <a:effectRef idx="0">
-                          <a:schemeClr val="accent2"/>
-                        </a:effectRef>
-                        <a:fontRef idx="minor">
-                          <a:schemeClr val="tx1"/>
-                        </a:fontRef>
-                      </wps:style>
-                      <wps:bodyPr/>
-                    </wps:wsp>
-                  </a:graphicData>
-                </a:graphic>
-                <wp14:sizeRelH relativeFrom="margin">
-                  <wp14:pctWidth>0</wp14:pctWidth>
-                </wp14:sizeRelH>
-                <wp14:sizeRelV relativeFrom="margin">
-                  <wp14:pctHeight>0</wp14:pctHeight>
-                </wp14:sizeRelV>
-              </wp:anchor>
-            </w:drawing>
-          </mc:Choice>
-          <mc:Fallback>
-            <w:pict>
-              <v:line w14:anchorId="6252318D" id="Connecteur droit 6" o:spid="_x0000_s1026" style="position:absolute;z-index:251653632;visibility:visible;mso-wrap-style:square;mso-width-percent:0;mso-height-percent:0;mso-wrap-distance-left:9pt;mso-wrap-distance-top:0;mso-wrap-distance-right:9pt;mso-wrap-distance-bottom:0;mso-position-horizontal:absolute;mso-position-horizontal-relative:text;mso-position-vertical:absolute;mso-position-vertical-relative:text;mso-width-percent:0;mso-height-percent:0;mso-width-relative:margin;mso-height-relative:margin" from="0,24.35pt" to="531.4pt,24.35pt" o:gfxdata="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" strokecolor="#8d2660 [3045]"/>
-            </w:pict>
-          </mc:Fallback>
-        </mc:AlternateContent>
-      </w:r>
-      <w:r>
-        <w:rPr>
-          <w:rFonts w:asciiTheme="majorHAnsi" w:hAnsiTheme="majorHAnsi" w:ascii="Calibri" w:hAnsi="Calibri"/>
-          <w:b/>
-          <w:color w:val="003366"/>
-          <w:sz w:val="28"/>
-          <w:szCs w:val="32"/>
-        </w:rPr>
-        <w:t>CONNAISSANCES TECHNIQUES</w:t>
-      </w:r>
-    </w:p>
-    <w:p>
-      <w:pPr>
-        <w:rPr>
-          <w:rFonts w:asciiTheme="majorHAnsi" w:hAnsiTheme="majorHAnsi"/>
-          <w:color w:val="1D1E3C" w:themeColor="text1"/>
-          <w:sz w:val="10"/>
-          <w:szCs w:val="10"/>
         </w:rPr>
       </w:pPr>
       <w:r>
@@ -258,6 +85,41 @@
           <w:ilvl w:val="0"/>
           <w:numId w:val="24"/>
         </w:numPr>
+        <w:rPr>
+          <w:rFonts w:asciiTheme="majorHAnsi" w:hAnsiTheme="majorHAnsi"/>
+          <w:color w:val="1D1E3C" w:themeColor="text2"/>
+          <w:sz w:val="32"/>
+          <w:szCs w:val="32"/>
+        </w:rPr>
+      </w:pPr>
+      <w:r/>
+    </w:p>
+    <w:p>
+      <w:pPr>
+        <w:rPr>
+          <w:rFonts w:asciiTheme="majorHAnsi" w:hAnsiTheme="majorHAnsi"/>
+          <w:color w:val="1D1E3C" w:themeColor="text1"/>
+          <w:sz w:val="10"/>
+          <w:szCs w:val="10"/>
+        </w:rPr>
+      </w:pPr>
+      <w:r>
+        <w:rPr>
+          <w:rFonts w:ascii="Calibri" w:hAnsi="Calibri"/>
+          <w:b/>
+          <w:color w:val="003366"/>
+          <w:sz w:val="28"/>
+        </w:rPr>
+        <w:t>COMPÉTENCES FONCTIONNELLES &amp; METIERS</w:t>
+      </w:r>
+    </w:p>
+    <w:p>
+      <w:pPr>
+        <w:pStyle w:val="Paragraphedeliste"/>
+        <w:numPr>
+          <w:ilvl w:val="0"/>
+          <w:numId w:val="24"/>
+        </w:numPr>
         <w:spacing w:before="240" w:line="240" w:lineRule="auto"/>
         <w:ind w:hanging="294"/>
         <w:rPr>
@@ -269,237 +131,7 @@
       </w:pPr>
       <w:r>
         <w:rPr>
-          <w:rFonts w:asciiTheme="majorHAnsi" w:hAnsiTheme="majorHAnsi" w:cstheme="minorHAnsi" w:ascii="Calibri" w:hAnsi="Calibri"/>
-          <w:b/>
-          <w:noProof/>
-          <w:color w:val="003366"/>
-          <w:sz w:val="28"/>
-          <w:szCs w:val="34"/>
-          <w:lang w:eastAsia="fr-FR"/>
-        </w:rPr>
-        <w:drawing>
-          <wp:anchor distT="0" distB="0" distL="114300" distR="114300" simplePos="0" relativeHeight="251687424" behindDoc="0" locked="0" layoutInCell="1" allowOverlap="1" wp14:anchorId="5097B114" wp14:editId="1FC3E20D">
-            <wp:simplePos x="0" y="0"/>
-            <wp:positionH relativeFrom="margin">
-              <wp:posOffset>6008370</wp:posOffset>
-            </wp:positionH>
-            <wp:positionV relativeFrom="paragraph">
-              <wp:posOffset>-635</wp:posOffset>
-            </wp:positionV>
-            <wp:extent cx="521970" cy="521970"/>
-            <wp:effectExtent l="0" t="0" r="0" b="0"/>
-            <wp:wrapSquare wrapText="bothSides"/>
-            <wp:docPr id="3" name="Image 3"/>
-            <wp:cNvGraphicFramePr>
-              <a:graphicFrameLocks xmlns:a="http://schemas.openxmlformats.org/drawingml/2006/main" noChangeAspect="1"/>
-            </wp:cNvGraphicFramePr>
-            <a:graphic xmlns:a="http://schemas.openxmlformats.org/drawingml/2006/main">
-              <a:graphicData uri="http://schemas.openxmlformats.org/drawingml/2006/picture">
-                <pic:pic xmlns:pic="http://schemas.openxmlformats.org/drawingml/2006/picture">
-                  <pic:nvPicPr>
-                    <pic:cNvPr id="0" name="Picture 4"/>
-                    <pic:cNvPicPr>
-                      <a:picLocks noChangeAspect="1" noChangeArrowheads="1"/>
-                    </pic:cNvPicPr>
-                  </pic:nvPicPr>
-                  <pic:blipFill>
-                    <a:blip r:embed="rId9" cstate="print">
-                      <a:extLst>
-                        <a:ext uri="{28A0092B-C50C-407E-A947-70E740481C1C}">
-                          <a14:useLocalDpi xmlns:a14="http://schemas.microsoft.com/office/drawing/2010/main" val="0"/>
-                        </a:ext>
-                      </a:extLst>
-                    </a:blip>
-                    <a:srcRect/>
-                    <a:stretch>
-                      <a:fillRect/>
-                    </a:stretch>
-                  </pic:blipFill>
-                  <pic:spPr bwMode="auto">
-                    <a:xfrm>
-                      <a:off x="0" y="0"/>
-                      <a:ext cx="521970" cy="521970"/>
-                    </a:xfrm>
-                    <a:prstGeom prst="rect">
-                      <a:avLst/>
-                    </a:prstGeom>
-                    <a:noFill/>
-                    <a:ln>
-                      <a:noFill/>
-                    </a:ln>
-                  </pic:spPr>
-                </pic:pic>
-              </a:graphicData>
-            </a:graphic>
-            <wp14:sizeRelH relativeFrom="margin">
-              <wp14:pctWidth>0</wp14:pctWidth>
-            </wp14:sizeRelH>
-            <wp14:sizeRelV relativeFrom="margin">
-              <wp14:pctHeight>0</wp14:pctHeight>
-            </wp14:sizeRelV>
-          </wp:anchor>
-        </w:drawing>
-      </w:r>
-      <w:r>
-        <w:rPr>
           <w:rFonts w:ascii="Calibri" w:hAnsi="Calibri"/>
-          <w:b/>
-          <w:noProof/>
-          <w:color w:val="003366"/>
-          <w:sz w:val="28"/>
-          <w:lang w:eastAsia="fr-FR"/>
-        </w:rPr>
-        <mc:AlternateContent>
-          <mc:Choice Requires="wps">
-            <w:drawing>
-              <wp:anchor distT="0" distB="0" distL="114300" distR="114300" simplePos="0" relativeHeight="251658752" behindDoc="0" locked="0" layoutInCell="1" allowOverlap="1" wp14:anchorId="2E115842" wp14:editId="66A4F1FE">
-                <wp:simplePos x="0" y="0"/>
-                <wp:positionH relativeFrom="column">
-                  <wp:posOffset>8890</wp:posOffset>
-                </wp:positionH>
-                <wp:positionV relativeFrom="paragraph">
-                  <wp:posOffset>466090</wp:posOffset>
-                </wp:positionV>
-                <wp:extent cx="6748780" cy="0"/>
-                <wp:effectExtent l="0" t="0" r="0" b="0"/>
-                <wp:wrapNone/>
-                <wp:docPr id="44" name="Connecteur droit 44"/>
-                <wp:cNvGraphicFramePr/>
-                <a:graphic xmlns:a="http://schemas.openxmlformats.org/drawingml/2006/main">
-                  <a:graphicData uri="http://schemas.microsoft.com/office/word/2010/wordprocessingShape">
-                    <wps:wsp>
-                      <wps:cNvCnPr/>
-                      <wps:spPr>
-                        <a:xfrm>
-                          <a:off x="0" y="0"/>
-                          <a:ext cx="6748780" cy="0"/>
-                        </a:xfrm>
-                        <a:prstGeom prst="line">
-                          <a:avLst/>
-                        </a:prstGeom>
-                        <a:ln/>
-                      </wps:spPr>
-                      <wps:style>
-                        <a:lnRef idx="1">
-                          <a:schemeClr val="accent2"/>
-                        </a:lnRef>
-                        <a:fillRef idx="0">
-                          <a:schemeClr val="accent2"/>
-                        </a:fillRef>
-                        <a:effectRef idx="0">
-                          <a:schemeClr val="accent2"/>
-                        </a:effectRef>
-                        <a:fontRef idx="minor">
-                          <a:schemeClr val="tx1"/>
-                        </a:fontRef>
-                      </wps:style>
-                      <wps:bodyPr/>
-                    </wps:wsp>
-                  </a:graphicData>
-                </a:graphic>
-                <wp14:sizeRelH relativeFrom="margin">
-                  <wp14:pctWidth>0</wp14:pctWidth>
-                </wp14:sizeRelH>
-                <wp14:sizeRelV relativeFrom="margin">
-                  <wp14:pctHeight>0</wp14:pctHeight>
-                </wp14:sizeRelV>
-              </wp:anchor>
-            </w:drawing>
-          </mc:Choice>
-          <mc:Fallback>
-            <w:pict>
-              <v:line w14:anchorId="7B9197C7" id="Connecteur droit 44" o:spid="_x0000_s1026" style="position:absolute;z-index:251658752;visibility:visible;mso-wrap-style:square;mso-width-percent:0;mso-height-percent:0;mso-wrap-distance-left:9pt;mso-wrap-distance-top:0;mso-wrap-distance-right:9pt;mso-wrap-distance-bottom:0;mso-position-horizontal:absolute;mso-position-horizontal-relative:text;mso-position-vertical:absolute;mso-position-vertical-relative:text;mso-width-percent:0;mso-height-percent:0;mso-width-relative:margin;mso-height-relative:margin" from=".7pt,36.7pt" to="532.1pt,36.7pt" o:gfxdata="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" strokecolor="#8d2660 [3045]"/>
-            </w:pict>
-          </mc:Fallback>
-        </mc:AlternateContent>
-      </w:r>
-      <w:r>
-        <w:rPr>
-          <w:rFonts w:asciiTheme="majorHAnsi" w:hAnsiTheme="majorHAnsi" w:cstheme="minorHAnsi" w:ascii="Calibri" w:hAnsi="Calibri"/>
-          <w:b/>
-          <w:noProof/>
-          <w:color w:val="003366"/>
-          <w:sz w:val="28"/>
-          <w:szCs w:val="34"/>
-          <w:lang w:eastAsia="fr-FR"/>
-        </w:rPr>
-        <w:t>COMP</w:t>
-      </w:r>
-      <w:r>
-        <w:rPr>
-          <w:rFonts w:asciiTheme="majorHAnsi" w:hAnsiTheme="majorHAnsi" w:cstheme="minorHAnsi" w:ascii="Calibri" w:hAnsi="Calibri"/>
-          <w:b/>
-          <w:noProof/>
-          <w:color w:val="003366"/>
-          <w:sz w:val="28"/>
-          <w:szCs w:val="34"/>
-          <w:lang w:eastAsia="fr-FR"/>
-        </w:rPr>
-        <w:t>É</w:t>
-      </w:r>
-      <w:r>
-        <w:rPr>
-          <w:rFonts w:asciiTheme="majorHAnsi" w:hAnsiTheme="majorHAnsi" w:cstheme="minorHAnsi" w:ascii="Calibri" w:hAnsi="Calibri"/>
-          <w:b/>
-          <w:noProof/>
-          <w:color w:val="003366"/>
-          <w:sz w:val="28"/>
-          <w:szCs w:val="34"/>
-          <w:lang w:eastAsia="fr-FR"/>
-        </w:rPr>
-        <w:t>TENCES</w:t>
-      </w:r>
-      <w:r>
-        <w:rPr>
-          <w:rFonts w:asciiTheme="majorHAnsi" w:hAnsiTheme="majorHAnsi" w:cstheme="minorHAnsi" w:ascii="Calibri" w:hAnsi="Calibri"/>
-          <w:b/>
-          <w:noProof/>
-          <w:color w:val="003366"/>
-          <w:sz w:val="28"/>
-          <w:szCs w:val="24"/>
-          <w:lang w:eastAsia="fr-FR"/>
-        </w:rPr>
-        <w:t xml:space="preserve"> </w:t>
-      </w:r>
-      <w:r>
-        <w:rPr>
-          <w:rFonts w:asciiTheme="majorHAnsi" w:hAnsiTheme="majorHAnsi" w:cstheme="minorHAnsi" w:ascii="Calibri" w:hAnsi="Calibri"/>
-          <w:b/>
-          <w:noProof/>
-          <w:color w:val="003366"/>
-          <w:sz w:val="28"/>
-          <w:szCs w:val="34"/>
-          <w:lang w:eastAsia="fr-FR"/>
-        </w:rPr>
-        <w:t xml:space="preserve">FONCTIONNELLES </w:t>
-      </w:r>
-      <w:r>
-        <w:rPr>
-          <w:rFonts w:asciiTheme="majorHAnsi" w:hAnsiTheme="majorHAnsi" w:cstheme="minorHAnsi" w:ascii="Calibri" w:hAnsi="Calibri"/>
-          <w:b/>
-          <w:noProof/>
-          <w:color w:val="003366"/>
-          <w:sz w:val="28"/>
-          <w:szCs w:val="34"/>
-          <w:lang w:eastAsia="fr-FR"/>
-        </w:rPr>
-        <w:t>&amp; METIERS</w:t>
-      </w:r>
-    </w:p>
-    <w:p>
-      <w:pPr>
-        <w:pStyle w:val="Paragraphedeliste"/>
-        <w:ind w:left="426"/>
-        <w:rPr>
-          <w:rFonts w:asciiTheme="majorHAnsi" w:hAnsiTheme="majorHAnsi"/>
-          <w:sz w:val="24"/>
-          <w:szCs w:val="24"/>
-        </w:rPr>
-      </w:pPr>
-      <w:r>
-        <w:rPr>
-          <w:rFonts w:ascii="Calibri" w:hAnsi="Calibri"/>
-          <w:color w:val="000000"/>
           <w:sz w:val="22"/>
         </w:rPr>
         <w:t>• Automatisation des processus de déploiement et infrastructure as code</w:t>
@@ -522,16 +154,14 @@
     <w:p>
       <w:pPr>
         <w:pStyle w:val="Paragraphedeliste"/>
-        <w:numPr>
-          <w:ilvl w:val="0"/>
-          <w:numId w:val="22"/>
-        </w:numPr>
+        <w:ind w:left="426"/>
         <w:rPr>
           <w:rFonts w:asciiTheme="majorHAnsi" w:hAnsiTheme="majorHAnsi"/>
           <w:sz w:val="24"/>
           <w:szCs w:val="24"/>
         </w:rPr>
       </w:pPr>
+      <w:r/>
     </w:p>
     <w:p>
       <w:pPr>
@@ -548,11 +178,12 @@
       </w:pPr>
       <w:r>
         <w:rPr>
-          <w:rFonts w:asciiTheme="majorHAnsi" w:hAnsiTheme="majorHAnsi"/>
-          <w:sz w:val="24"/>
-          <w:szCs w:val="24"/>
-        </w:rPr>
-        <w:t xml:space="preserve"> </w:t>
+          <w:rFonts w:ascii="Calibri" w:hAnsi="Calibri"/>
+          <w:b/>
+          <w:color w:val="003366"/>
+          <w:sz w:val="28"/>
+        </w:rPr>
+        <w:t>EXPÉRIENCES ET PRINCIPALES RÉALISATIONS</w:t>
       </w:r>
     </w:p>
     <w:p>
@@ -568,6 +199,29 @@
           <w:szCs w:val="24"/>
         </w:rPr>
       </w:pPr>
+      <w:r/>
+    </w:p>
+    <w:p>
+      <w:pPr>
+        <w:pStyle w:val="Paragraphedeliste"/>
+        <w:numPr>
+          <w:ilvl w:val="0"/>
+          <w:numId w:val="22"/>
+        </w:numPr>
+        <w:rPr>
+          <w:rFonts w:asciiTheme="majorHAnsi" w:hAnsiTheme="majorHAnsi"/>
+          <w:sz w:val="24"/>
+          <w:szCs w:val="24"/>
+        </w:rPr>
+      </w:pPr>
+      <w:r>
+        <w:rPr>
+          <w:rFonts w:ascii="Calibri" w:hAnsi="Calibri"/>
+          <w:b/>
+          <w:sz w:val="22"/>
+        </w:rPr>
+        <w:t>Ingénieur DevOps &amp; systèmes | SEDI-ATI Fibres Optiques</w:t>
+      </w:r>
     </w:p>
     <w:p>
       <w:pPr>
@@ -585,12 +239,10 @@
       </w:pPr>
       <w:r>
         <w:rPr>
-          <w:rFonts w:asciiTheme="majorHAnsi" w:hAnsiTheme="majorHAnsi"/>
-          <w:color w:val="1D1E3C" w:themeColor="text2"/>
-          <w:sz w:val="10"/>
-          <w:szCs w:val="10"/>
-        </w:rPr>
-        <w:br w:type="page"/>
+          <w:rFonts w:ascii="Calibri" w:hAnsi="Calibri"/>
+          <w:sz w:val="22"/>
+        </w:rPr>
+        <w:t>2024 – aujourd'hui | Île-de-France</w:t>
       </w:r>
     </w:p>
     <w:p>
@@ -602,306 +254,9 @@
           <w:szCs w:val="4"/>
         </w:rPr>
       </w:pPr>
-    </w:p>
-    <w:p>
-      <w:pPr>
-        <w:rPr>
-          <w:rFonts w:asciiTheme="majorHAnsi" w:hAnsiTheme="majorHAnsi"/>
-          <w:color w:val="1D1E3C" w:themeColor="text2"/>
-          <w:sz w:val="10"/>
-          <w:szCs w:val="10"/>
-        </w:rPr>
-      </w:pPr>
-    </w:p>
-    <w:p>
-      <w:pPr>
-        <w:rPr>
-          <w:rFonts w:asciiTheme="majorHAnsi" w:hAnsiTheme="majorHAnsi"/>
-          <w:color w:val="1D1E3C" w:themeColor="text2"/>
-          <w:sz w:val="10"/>
-          <w:szCs w:val="10"/>
-        </w:rPr>
-      </w:pPr>
       <w:r>
         <w:rPr>
-          <w:noProof/>
-          <w:sz w:val="2"/>
-          <w:szCs w:val="2"/>
-        </w:rPr>
-        <w:drawing>
-          <wp:anchor distT="0" distB="0" distL="114300" distR="114300" simplePos="0" relativeHeight="251688448" behindDoc="0" locked="0" layoutInCell="1" allowOverlap="1" wp14:anchorId="56627A22" wp14:editId="22117BF2">
-            <wp:simplePos x="0" y="0"/>
-            <wp:positionH relativeFrom="margin">
-              <wp:align>right</wp:align>
-            </wp:positionH>
-            <wp:positionV relativeFrom="paragraph">
-              <wp:posOffset>0</wp:posOffset>
-            </wp:positionV>
-            <wp:extent cx="495935" cy="495935"/>
-            <wp:effectExtent l="0" t="0" r="0" b="0"/>
-            <wp:wrapSquare wrapText="bothSides"/>
-            <wp:docPr id="8" name="Image 8"/>
-            <wp:cNvGraphicFramePr>
-              <a:graphicFrameLocks xmlns:a="http://schemas.openxmlformats.org/drawingml/2006/main" noChangeAspect="1"/>
-            </wp:cNvGraphicFramePr>
-            <a:graphic xmlns:a="http://schemas.openxmlformats.org/drawingml/2006/main">
-              <a:graphicData uri="http://schemas.openxmlformats.org/drawingml/2006/picture">
-                <pic:pic xmlns:pic="http://schemas.openxmlformats.org/drawingml/2006/picture">
-                  <pic:nvPicPr>
-                    <pic:cNvPr id="0" name="Picture 5"/>
-                    <pic:cNvPicPr>
-                      <a:picLocks noChangeAspect="1" noChangeArrowheads="1"/>
-                    </pic:cNvPicPr>
-                  </pic:nvPicPr>
-                  <pic:blipFill>
-                    <a:blip r:embed="rId10" cstate="print">
-                      <a:extLst>
-                        <a:ext uri="{28A0092B-C50C-407E-A947-70E740481C1C}">
-                          <a14:useLocalDpi xmlns:a14="http://schemas.microsoft.com/office/drawing/2010/main" val="0"/>
-                        </a:ext>
-                      </a:extLst>
-                    </a:blip>
-                    <a:srcRect/>
-                    <a:stretch>
-                      <a:fillRect/>
-                    </a:stretch>
-                  </pic:blipFill>
-                  <pic:spPr bwMode="auto">
-                    <a:xfrm>
-                      <a:off x="0" y="0"/>
-                      <a:ext cx="495935" cy="495935"/>
-                    </a:xfrm>
-                    <a:prstGeom prst="rect">
-                      <a:avLst/>
-                    </a:prstGeom>
-                    <a:noFill/>
-                    <a:ln>
-                      <a:noFill/>
-                    </a:ln>
-                  </pic:spPr>
-                </pic:pic>
-              </a:graphicData>
-            </a:graphic>
-            <wp14:sizeRelH relativeFrom="margin">
-              <wp14:pctWidth>0</wp14:pctWidth>
-            </wp14:sizeRelH>
-            <wp14:sizeRelV relativeFrom="margin">
-              <wp14:pctHeight>0</wp14:pctHeight>
-            </wp14:sizeRelV>
-          </wp:anchor>
-        </w:drawing>
-      </w:r>
-    </w:p>
-    <w:p>
-      <w:pPr>
-        <w:pStyle w:val="Paragraphedeliste"/>
-        <w:numPr>
-          <w:ilvl w:val="0"/>
-          <w:numId w:val="24"/>
-        </w:numPr>
-        <w:ind w:hanging="294"/>
-        <w:rPr>
-          <w:rFonts w:asciiTheme="majorHAnsi" w:hAnsiTheme="majorHAnsi"/>
-          <w:color w:val="1D1E3C" w:themeColor="text2"/>
-          <w:sz w:val="32"/>
-          <w:szCs w:val="24"/>
-        </w:rPr>
-      </w:pPr>
-      <w:r>
-        <w:rPr>
           <w:rFonts w:ascii="Calibri" w:hAnsi="Calibri"/>
-          <w:b/>
-          <w:noProof/>
-          <w:color w:val="003366"/>
-          <w:sz w:val="28"/>
-          <w:lang w:eastAsia="fr-FR"/>
-        </w:rPr>
-        <mc:AlternateContent>
-          <mc:Choice Requires="wps">
-            <w:drawing>
-              <wp:anchor distT="0" distB="0" distL="114300" distR="114300" simplePos="0" relativeHeight="251655680" behindDoc="0" locked="0" layoutInCell="1" allowOverlap="1" wp14:anchorId="735DCCBE" wp14:editId="1BFA7A90">
-                <wp:simplePos x="0" y="0"/>
-                <wp:positionH relativeFrom="column">
-                  <wp:posOffset>8890</wp:posOffset>
-                </wp:positionH>
-                <wp:positionV relativeFrom="paragraph">
-                  <wp:posOffset>313372</wp:posOffset>
-                </wp:positionV>
-                <wp:extent cx="6748780" cy="0"/>
-                <wp:effectExtent l="0" t="0" r="0" b="0"/>
-                <wp:wrapNone/>
-                <wp:docPr id="7" name="Connecteur droit 7"/>
-                <wp:cNvGraphicFramePr/>
-                <a:graphic xmlns:a="http://schemas.openxmlformats.org/drawingml/2006/main">
-                  <a:graphicData uri="http://schemas.microsoft.com/office/word/2010/wordprocessingShape">
-                    <wps:wsp>
-                      <wps:cNvCnPr/>
-                      <wps:spPr>
-                        <a:xfrm>
-                          <a:off x="0" y="0"/>
-                          <a:ext cx="6748780" cy="0"/>
-                        </a:xfrm>
-                        <a:prstGeom prst="line">
-                          <a:avLst/>
-                        </a:prstGeom>
-                        <a:ln/>
-                      </wps:spPr>
-                      <wps:style>
-                        <a:lnRef idx="1">
-                          <a:schemeClr val="accent2"/>
-                        </a:lnRef>
-                        <a:fillRef idx="0">
-                          <a:schemeClr val="accent2"/>
-                        </a:fillRef>
-                        <a:effectRef idx="0">
-                          <a:schemeClr val="accent2"/>
-                        </a:effectRef>
-                        <a:fontRef idx="minor">
-                          <a:schemeClr val="tx1"/>
-                        </a:fontRef>
-                      </wps:style>
-                      <wps:bodyPr/>
-                    </wps:wsp>
-                  </a:graphicData>
-                </a:graphic>
-                <wp14:sizeRelH relativeFrom="margin">
-                  <wp14:pctWidth>0</wp14:pctWidth>
-                </wp14:sizeRelH>
-                <wp14:sizeRelV relativeFrom="margin">
-                  <wp14:pctHeight>0</wp14:pctHeight>
-                </wp14:sizeRelV>
-              </wp:anchor>
-            </w:drawing>
-          </mc:Choice>
-          <mc:Fallback>
-            <w:pict>
-              <v:line w14:anchorId="61BE832D" id="Connecteur droit 7" o:spid="_x0000_s1026" style="position:absolute;z-index:251655680;visibility:visible;mso-wrap-style:square;mso-width-percent:0;mso-height-percent:0;mso-wrap-distance-left:9pt;mso-wrap-distance-top:0;mso-wrap-distance-right:9pt;mso-wrap-distance-bottom:0;mso-position-horizontal:absolute;mso-position-horizontal-relative:text;mso-position-vertical:absolute;mso-position-vertical-relative:text;mso-width-percent:0;mso-height-percent:0;mso-width-relative:margin;mso-height-relative:margin" from=".7pt,24.65pt" to="532.1pt,24.65pt" o:gfxdata="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" strokecolor="#8d2660 [3045]"/>
-            </w:pict>
-          </mc:Fallback>
-        </mc:AlternateContent>
-      </w:r>
-      <w:r>
-        <w:rPr>
-          <w:rFonts w:asciiTheme="majorHAnsi" w:hAnsiTheme="majorHAnsi" w:ascii="Calibri" w:hAnsi="Calibri"/>
-          <w:b/>
-          <w:color w:val="003366"/>
-          <w:sz w:val="28"/>
-          <w:szCs w:val="24"/>
-        </w:rPr>
-        <w:t>EXP</w:t>
-      </w:r>
-      <w:r>
-        <w:rPr>
-          <w:rFonts w:asciiTheme="majorHAnsi" w:hAnsiTheme="majorHAnsi" w:ascii="Calibri" w:hAnsi="Calibri"/>
-          <w:b/>
-          <w:color w:val="003366"/>
-          <w:sz w:val="28"/>
-          <w:szCs w:val="24"/>
-        </w:rPr>
-        <w:t>É</w:t>
-      </w:r>
-      <w:r>
-        <w:rPr>
-          <w:rFonts w:asciiTheme="majorHAnsi" w:hAnsiTheme="majorHAnsi" w:ascii="Calibri" w:hAnsi="Calibri"/>
-          <w:b/>
-          <w:color w:val="003366"/>
-          <w:sz w:val="28"/>
-          <w:szCs w:val="24"/>
-        </w:rPr>
-        <w:t>RIENCES ET PRINCIPALES R</w:t>
-      </w:r>
-      <w:r>
-        <w:rPr>
-          <w:rFonts w:asciiTheme="majorHAnsi" w:hAnsiTheme="majorHAnsi" w:ascii="Calibri" w:hAnsi="Calibri"/>
-          <w:b/>
-          <w:color w:val="003366"/>
-          <w:sz w:val="28"/>
-          <w:szCs w:val="24"/>
-        </w:rPr>
-        <w:t>É</w:t>
-      </w:r>
-      <w:r>
-        <w:rPr>
-          <w:rFonts w:asciiTheme="majorHAnsi" w:hAnsiTheme="majorHAnsi" w:ascii="Calibri" w:hAnsi="Calibri"/>
-          <w:b/>
-          <w:color w:val="003366"/>
-          <w:sz w:val="28"/>
-          <w:szCs w:val="24"/>
-        </w:rPr>
-        <w:t>ALISATIONS</w:t>
-      </w:r>
-    </w:p>
-    <w:p>
-      <w:pPr>
-        <w:spacing w:line="360" w:lineRule="auto"/>
-        <w:rPr>
-          <w:rFonts w:ascii="Roboto Lt" w:hAnsi="Roboto Lt"/>
-          <w:color w:val="3750BE" w:themeColor="accent1"/>
-          <w:sz w:val="8"/>
-          <w:szCs w:val="8"/>
-        </w:rPr>
-      </w:pPr>
-    </w:p>
-    <w:p>
-      <w:pPr>
-        <w:spacing w:line="360" w:lineRule="auto"/>
-        <w:rPr>
-          <w:color w:val="1D1E3C" w:themeColor="text2"/>
-          <w:sz w:val="24"/>
-          <w:szCs w:val="24"/>
-        </w:rPr>
-      </w:pPr>
-      <w:r>
-        <w:rPr>
-          <w:rFonts w:ascii="Calibri" w:hAnsi="Calibri"/>
-          <w:b/>
-          <w:color w:val="333333"/>
-          <w:sz w:val="22"/>
-        </w:rPr>
-        <w:t>Ingénieur DevOps &amp; systèmes | SEDI-ATI Fibres Optiques</w:t>
-      </w:r>
-    </w:p>
-    <w:p>
-      <w:pPr>
-        <w:pStyle w:val="Paragraphedeliste"/>
-        <w:numPr>
-          <w:ilvl w:val="0"/>
-          <w:numId w:val="23"/>
-        </w:numPr>
-        <w:rPr>
-          <w:rFonts w:ascii="Roboto" w:hAnsi="Roboto"/>
-          <w:color w:val="952866" w:themeColor="accent2"/>
-          <w:sz w:val="24"/>
-          <w:szCs w:val="24"/>
-        </w:rPr>
-      </w:pPr>
-      <w:r>
-        <w:rPr>
-          <w:rFonts w:ascii="Calibri" w:hAnsi="Calibri"/>
-          <w:color w:val="000000"/>
-          <w:sz w:val="22"/>
-        </w:rPr>
-        <w:t>2024 – aujourd'hui | Île-de-France</w:t>
-      </w:r>
-    </w:p>
-    <w:p>
-      <w:pPr>
-        <w:pStyle w:val="Paragraphedeliste"/>
-        <w:numPr>
-          <w:ilvl w:val="0"/>
-          <w:numId w:val="23"/>
-        </w:numPr>
-        <w:rPr>
-          <w:rFonts w:ascii="Roboto" w:hAnsi="Roboto"/>
-          <w:color w:val="952866" w:themeColor="accent2"/>
-          <w:sz w:val="24"/>
-          <w:szCs w:val="24"/>
-        </w:rPr>
-      </w:pPr>
-      <w:r>
-        <w:rPr>
-          <w:rFonts w:ascii="Calibri" w:hAnsi="Calibri"/>
-          <w:color w:val="000000"/>
           <w:sz w:val="22"/>
         </w:rPr>
         <w:t>Fabricant de fibres optiques · automatisation des processus atelier et IT</w:t>
@@ -922,67 +277,79 @@
     </w:p>
     <w:p>
       <w:pPr>
+        <w:rPr>
+          <w:rFonts w:asciiTheme="majorHAnsi" w:hAnsiTheme="majorHAnsi"/>
+          <w:color w:val="1D1E3C" w:themeColor="text2"/>
+          <w:sz w:val="10"/>
+          <w:szCs w:val="10"/>
+        </w:rPr>
+      </w:pPr>
+      <w:r>
+        <w:rPr>
+          <w:rFonts w:ascii="Calibri" w:hAnsi="Calibri"/>
+          <w:i/>
+          <w:sz w:val="20"/>
+        </w:rPr>
+        <w:t>Environnement : Python, Bash, Node.js, SQL Server, Docker, Jenkins, GitHub Actions, SonarQube, Terraform, Ansible, Vault, Nginx, Red Hat Linux, SRE</w:t>
+      </w:r>
+    </w:p>
+    <w:p>
+      <w:pPr>
+        <w:rPr>
+          <w:rFonts w:asciiTheme="majorHAnsi" w:hAnsiTheme="majorHAnsi"/>
+          <w:color w:val="1D1E3C" w:themeColor="text2"/>
+          <w:sz w:val="10"/>
+          <w:szCs w:val="10"/>
+        </w:rPr>
+      </w:pPr>
+      <w:r/>
+    </w:p>
+    <w:p>
+      <w:pPr>
         <w:pStyle w:val="Paragraphedeliste"/>
         <w:numPr>
           <w:ilvl w:val="0"/>
-          <w:numId w:val="23"/>
+          <w:numId w:val="24"/>
         </w:numPr>
-        <w:rPr>
-          <w:rFonts w:ascii="Roboto" w:hAnsi="Roboto"/>
-          <w:color w:val="952866" w:themeColor="accent2"/>
-          <w:sz w:val="24"/>
+        <w:ind w:hanging="294"/>
+        <w:rPr>
+          <w:rFonts w:asciiTheme="majorHAnsi" w:hAnsiTheme="majorHAnsi"/>
+          <w:color w:val="1D1E3C" w:themeColor="text2"/>
+          <w:sz w:val="32"/>
           <w:szCs w:val="24"/>
         </w:rPr>
       </w:pPr>
-    </w:p>
-    <w:p>
-      <w:pPr>
-        <w:pStyle w:val="Paragraphedeliste"/>
-        <w:numPr>
-          <w:ilvl w:val="0"/>
-          <w:numId w:val="23"/>
-        </w:numPr>
-        <w:rPr>
-          <w:rFonts w:ascii="Roboto" w:hAnsi="Roboto"/>
-          <w:color w:val="952866" w:themeColor="accent2"/>
-          <w:sz w:val="24"/>
-          <w:szCs w:val="24"/>
-        </w:rPr>
-      </w:pPr>
-    </w:p>
-    <w:p>
-      <w:pPr>
-        <w:rPr>
-          <w:rFonts w:ascii="Roboto" w:hAnsi="Roboto"/>
-          <w:sz w:val="24"/>
-          <w:szCs w:val="24"/>
-        </w:rPr>
-      </w:pPr>
       <w:r>
         <w:rPr>
           <w:rFonts w:ascii="Calibri" w:hAnsi="Calibri"/>
-          <w:i/>
-          <w:color w:val="000000"/>
-          <w:sz w:val="20"/>
-        </w:rPr>
-        <w:t>Environnement : Python, Bash, Node.js, SQL Server, Docker, Jenkins, GitHub Actions, SonarQube, Terraform, Ansible, Vault, Nginx, Red Hat Linux, SRE</w:t>
+          <w:b/>
+          <w:sz w:val="22"/>
+        </w:rPr>
+        <w:t>Ingénieur DevOps &amp; Cloud | Rentsafe</w:t>
       </w:r>
     </w:p>
     <w:p>
       <w:pPr>
-        <w:rPr>
-          <w:rFonts w:ascii="Roboto" w:hAnsi="Roboto"/>
-          <w:color w:val="313366" w:themeColor="text1" w:themeTint="D9"/>
-          <w:sz w:val="24"/>
-          <w:szCs w:val="24"/>
-        </w:rPr>
-      </w:pPr>
-    </w:p>
-    <w:p>
-      <w:pPr>
         <w:spacing w:line="360" w:lineRule="auto"/>
         <w:rPr>
-          <w:rFonts w:ascii="Roboto" w:hAnsi="Roboto"/>
+          <w:rFonts w:ascii="Roboto Lt" w:hAnsi="Roboto Lt"/>
+          <w:color w:val="3750BE" w:themeColor="accent1"/>
+          <w:sz w:val="8"/>
+          <w:szCs w:val="8"/>
+        </w:rPr>
+      </w:pPr>
+      <w:r>
+        <w:rPr>
+          <w:rFonts w:ascii="Calibri" w:hAnsi="Calibri"/>
+          <w:sz w:val="22"/>
+        </w:rPr>
+        <w:t>2022 – 2024 | Île-de-France</w:t>
+      </w:r>
+    </w:p>
+    <w:p>
+      <w:pPr>
+        <w:spacing w:line="360" w:lineRule="auto"/>
+        <w:rPr>
           <w:color w:val="1D1E3C" w:themeColor="text2"/>
           <w:sz w:val="24"/>
           <w:szCs w:val="24"/>
@@ -991,42 +358,6 @@
       <w:r>
         <w:rPr>
           <w:rFonts w:ascii="Calibri" w:hAnsi="Calibri"/>
-          <w:b/>
-          <w:color w:val="333333"/>
-          <w:sz w:val="22"/>
-        </w:rPr>
-        <w:t>Ingénieur DevOps &amp; Cloud | Rentsafe</w:t>
-      </w:r>
-    </w:p>
-    <w:p>
-      <w:pPr>
-        <w:pStyle w:val="Paragraphedeliste"/>
-        <w:numPr>
-          <w:ilvl w:val="0"/>
-          <w:numId w:val="10"/>
-        </w:numPr>
-        <w:ind w:hanging="217"/>
-        <w:rPr>
-          <w:rFonts w:ascii="Roboto" w:hAnsi="Roboto"/>
-          <w:color w:val="4256A6"/>
-          <w:sz w:val="24"/>
-          <w:szCs w:val="24"/>
-        </w:rPr>
-      </w:pPr>
-      <w:r>
-        <w:rPr>
-          <w:rFonts w:ascii="Calibri" w:hAnsi="Calibri"/>
-          <w:color w:val="000000"/>
-          <w:sz w:val="22"/>
-        </w:rPr>
-        <w:t>2022 – 2024 | Île-de-France</w:t>
-      </w:r>
-    </w:p>
-    <w:p>
-      <w:r>
-        <w:rPr>
-          <w:rFonts w:ascii="Calibri" w:hAnsi="Calibri"/>
-          <w:color w:val="000000"/>
           <w:sz w:val="22"/>
         </w:rPr>
         <w:t>Webapp sur Kubernetes AWS · prod : rentsafe-app.com</w:t>
@@ -1048,12 +379,11 @@
         <w:pStyle w:val="Paragraphedeliste"/>
         <w:numPr>
           <w:ilvl w:val="0"/>
-          <w:numId w:val="10"/>
+          <w:numId w:val="23"/>
         </w:numPr>
-        <w:ind w:hanging="217"/>
         <w:rPr>
           <w:rFonts w:ascii="Roboto" w:hAnsi="Roboto"/>
-          <w:color w:val="4256A6"/>
+          <w:color w:val="952866" w:themeColor="accent2"/>
           <w:sz w:val="24"/>
           <w:szCs w:val="24"/>
         </w:rPr>
@@ -1062,7 +392,6 @@
         <w:rPr>
           <w:rFonts w:ascii="Calibri" w:hAnsi="Calibri"/>
           <w:i/>
-          <w:color w:val="000000"/>
           <w:sz w:val="20"/>
         </w:rPr>
         <w:t>Environnement : Kubernetes, Docker, Jenkins, GitLab CI, Terraform, AWS, CloudFront, ALB, Prometheus, Grafana, Ansible, SRE, SLI/SLO</w:t>
@@ -1073,48 +402,56 @@
         <w:pStyle w:val="Paragraphedeliste"/>
         <w:numPr>
           <w:ilvl w:val="0"/>
-          <w:numId w:val="10"/>
+          <w:numId w:val="23"/>
         </w:numPr>
-        <w:ind w:hanging="217"/>
         <w:rPr>
           <w:rFonts w:ascii="Roboto" w:hAnsi="Roboto"/>
-          <w:color w:val="4256A6"/>
+          <w:color w:val="952866" w:themeColor="accent2"/>
           <w:sz w:val="24"/>
           <w:szCs w:val="24"/>
         </w:rPr>
       </w:pPr>
+      <w:r/>
     </w:p>
     <w:p>
       <w:pPr>
         <w:pStyle w:val="Paragraphedeliste"/>
         <w:numPr>
           <w:ilvl w:val="0"/>
-          <w:numId w:val="10"/>
+          <w:numId w:val="23"/>
         </w:numPr>
-        <w:ind w:hanging="217"/>
         <w:rPr>
           <w:rFonts w:ascii="Roboto" w:hAnsi="Roboto"/>
-          <w:color w:val="4256A6"/>
+          <w:color w:val="952866" w:themeColor="accent2"/>
           <w:sz w:val="24"/>
           <w:szCs w:val="24"/>
         </w:rPr>
       </w:pPr>
+      <w:r>
+        <w:rPr>
+          <w:rFonts w:ascii="Calibri" w:hAnsi="Calibri"/>
+          <w:b/>
+          <w:color w:val="003366"/>
+          <w:sz w:val="28"/>
+        </w:rPr>
+        <w:t>PROJETS PERSONNELS ET/OU PROJETS D'ÉTUDES</w:t>
+      </w:r>
     </w:p>
     <w:p>
       <w:pPr>
         <w:pStyle w:val="Paragraphedeliste"/>
         <w:numPr>
           <w:ilvl w:val="0"/>
-          <w:numId w:val="10"/>
+          <w:numId w:val="23"/>
         </w:numPr>
-        <w:ind w:hanging="217"/>
         <w:rPr>
           <w:rFonts w:ascii="Roboto" w:hAnsi="Roboto"/>
-          <w:color w:val="4256A6"/>
+          <w:color w:val="952866" w:themeColor="accent2"/>
           <w:sz w:val="24"/>
           <w:szCs w:val="24"/>
         </w:rPr>
       </w:pPr>
+      <w:r/>
     </w:p>
     <w:p>
       <w:pPr>
@@ -1124,7 +461,14 @@
           <w:szCs w:val="24"/>
         </w:rPr>
       </w:pPr>
-      <w:r/>
+      <w:r>
+        <w:rPr>
+          <w:rFonts w:ascii="Calibri" w:hAnsi="Calibri"/>
+          <w:b/>
+          <w:sz w:val="22"/>
+        </w:rPr>
+        <w:t>Epitech – Île-de-France</w:t>
+      </w:r>
     </w:p>
     <w:p>
       <w:pPr>
@@ -1135,360 +479,9 @@
           <w:szCs w:val="24"/>
         </w:rPr>
       </w:pPr>
-    </w:p>
-    <w:p>
-      <w:pPr>
-        <w:spacing w:line="360" w:lineRule="auto"/>
-        <w:rPr>
-          <w:color w:val="1D1E3C" w:themeColor="text2"/>
-          <w:sz w:val="24"/>
-          <w:szCs w:val="24"/>
-        </w:rPr>
-      </w:pPr>
-      <w:r/>
-    </w:p>
-    <w:p>
-      <w:pPr>
-        <w:pStyle w:val="Paragraphedeliste"/>
-        <w:numPr>
-          <w:ilvl w:val="0"/>
-          <w:numId w:val="10"/>
-        </w:numPr>
-        <w:ind w:hanging="218"/>
-        <w:rPr>
-          <w:rFonts w:ascii="Roboto" w:hAnsi="Roboto"/>
-          <w:color w:val="4256A6"/>
-          <w:sz w:val="24"/>
-          <w:szCs w:val="24"/>
-        </w:rPr>
-      </w:pPr>
-    </w:p>
-    <w:p>
-      <w:pPr>
-        <w:pStyle w:val="Paragraphedeliste"/>
-        <w:numPr>
-          <w:ilvl w:val="0"/>
-          <w:numId w:val="10"/>
-        </w:numPr>
-        <w:ind w:hanging="218"/>
-        <w:rPr>
-          <w:rFonts w:ascii="Roboto" w:hAnsi="Roboto"/>
-          <w:color w:val="4256A6"/>
-          <w:sz w:val="24"/>
-          <w:szCs w:val="24"/>
-        </w:rPr>
-      </w:pPr>
-    </w:p>
-    <w:p>
-      <w:pPr>
-        <w:pStyle w:val="Paragraphedeliste"/>
-        <w:numPr>
-          <w:ilvl w:val="0"/>
-          <w:numId w:val="10"/>
-        </w:numPr>
-        <w:ind w:hanging="218"/>
-        <w:rPr>
-          <w:rFonts w:ascii="Roboto" w:hAnsi="Roboto"/>
-          <w:color w:val="4256A6"/>
-          <w:sz w:val="24"/>
-          <w:szCs w:val="24"/>
-        </w:rPr>
-      </w:pPr>
-    </w:p>
-    <w:p>
-      <w:pPr>
-        <w:pStyle w:val="Paragraphedeliste"/>
-        <w:numPr>
-          <w:ilvl w:val="0"/>
-          <w:numId w:val="10"/>
-        </w:numPr>
-        <w:ind w:hanging="218"/>
-        <w:rPr>
-          <w:rFonts w:ascii="Roboto" w:hAnsi="Roboto"/>
-          <w:color w:val="4256A6"/>
-          <w:sz w:val="24"/>
-          <w:szCs w:val="24"/>
-        </w:rPr>
-      </w:pPr>
-    </w:p>
-    <w:p>
-      <w:pPr>
-        <w:pStyle w:val="Paragraphedeliste"/>
-        <w:numPr>
-          <w:ilvl w:val="0"/>
-          <w:numId w:val="10"/>
-        </w:numPr>
-        <w:ind w:hanging="218"/>
-        <w:rPr>
-          <w:rFonts w:ascii="Roboto" w:hAnsi="Roboto"/>
-          <w:sz w:val="24"/>
-          <w:szCs w:val="24"/>
-        </w:rPr>
-      </w:pPr>
-    </w:p>
-    <w:p>
-      <w:pPr>
-        <w:rPr>
-          <w:rFonts w:ascii="Roboto" w:hAnsi="Roboto"/>
-          <w:sz w:val="24"/>
-          <w:szCs w:val="24"/>
-        </w:rPr>
-      </w:pPr>
-      <w:r/>
-    </w:p>
-    <w:p>
-      <w:pPr>
-        <w:rPr>
-          <w:rFonts w:asciiTheme="majorHAnsi" w:hAnsiTheme="majorHAnsi"/>
-          <w:color w:val="3750BE" w:themeColor="accent1"/>
-          <w:sz w:val="28"/>
-          <w:szCs w:val="44"/>
-        </w:rPr>
-      </w:pPr>
-    </w:p>
-    <w:p>
-      <w:pPr>
-        <w:spacing w:after="0"/>
-        <w:rPr>
-          <w:rFonts w:asciiTheme="majorHAnsi" w:hAnsiTheme="majorHAnsi"/>
-          <w:color w:val="3750BE" w:themeColor="accent1"/>
-          <w:szCs w:val="36"/>
-        </w:rPr>
-      </w:pPr>
       <w:r>
         <w:rPr>
-          <w:noProof/>
-        </w:rPr>
-        <w:drawing>
-          <wp:anchor distT="0" distB="0" distL="114300" distR="114300" simplePos="0" relativeHeight="251689472" behindDoc="0" locked="0" layoutInCell="1" allowOverlap="1" wp14:anchorId="3D25E2F7" wp14:editId="1F91E336">
-            <wp:simplePos x="0" y="0"/>
-            <wp:positionH relativeFrom="margin">
-              <wp:posOffset>6105525</wp:posOffset>
-            </wp:positionH>
-            <wp:positionV relativeFrom="paragraph">
-              <wp:posOffset>22860</wp:posOffset>
-            </wp:positionV>
-            <wp:extent cx="442595" cy="442595"/>
-            <wp:effectExtent l="0" t="0" r="0" b="0"/>
-            <wp:wrapSquare wrapText="bothSides"/>
-            <wp:docPr id="9" name="Image 9"/>
-            <wp:cNvGraphicFramePr>
-              <a:graphicFrameLocks xmlns:a="http://schemas.openxmlformats.org/drawingml/2006/main" noChangeAspect="1"/>
-            </wp:cNvGraphicFramePr>
-            <a:graphic xmlns:a="http://schemas.openxmlformats.org/drawingml/2006/main">
-              <a:graphicData uri="http://schemas.openxmlformats.org/drawingml/2006/picture">
-                <pic:pic xmlns:pic="http://schemas.openxmlformats.org/drawingml/2006/picture">
-                  <pic:nvPicPr>
-                    <pic:cNvPr id="0" name="Picture 6"/>
-                    <pic:cNvPicPr>
-                      <a:picLocks noChangeAspect="1" noChangeArrowheads="1"/>
-                    </pic:cNvPicPr>
-                  </pic:nvPicPr>
-                  <pic:blipFill>
-                    <a:blip r:embed="rId11" cstate="print">
-                      <a:extLst>
-                        <a:ext uri="{28A0092B-C50C-407E-A947-70E740481C1C}">
-                          <a14:useLocalDpi xmlns:a14="http://schemas.microsoft.com/office/drawing/2010/main" val="0"/>
-                        </a:ext>
-                      </a:extLst>
-                    </a:blip>
-                    <a:srcRect/>
-                    <a:stretch>
-                      <a:fillRect/>
-                    </a:stretch>
-                  </pic:blipFill>
-                  <pic:spPr bwMode="auto">
-                    <a:xfrm>
-                      <a:off x="0" y="0"/>
-                      <a:ext cx="442595" cy="442595"/>
-                    </a:xfrm>
-                    <a:prstGeom prst="rect">
-                      <a:avLst/>
-                    </a:prstGeom>
-                    <a:noFill/>
-                    <a:ln>
-                      <a:noFill/>
-                    </a:ln>
-                  </pic:spPr>
-                </pic:pic>
-              </a:graphicData>
-            </a:graphic>
-            <wp14:sizeRelH relativeFrom="margin">
-              <wp14:pctWidth>0</wp14:pctWidth>
-            </wp14:sizeRelH>
-            <wp14:sizeRelV relativeFrom="margin">
-              <wp14:pctHeight>0</wp14:pctHeight>
-            </wp14:sizeRelV>
-          </wp:anchor>
-        </w:drawing>
-      </w:r>
-      <w:r>
-        <w:rPr>
-          <w:rFonts w:asciiTheme="majorHAnsi" w:hAnsiTheme="majorHAnsi"/>
-          <w:color w:val="3750BE" w:themeColor="accent1"/>
-          <w:sz w:val="20"/>
-          <w:szCs w:val="32"/>
-        </w:rPr>
-        <w:t xml:space="preserve"> </w:t>
-      </w:r>
-    </w:p>
-    <w:p>
-      <w:pPr>
-        <w:pStyle w:val="Paragraphedeliste"/>
-        <w:numPr>
-          <w:ilvl w:val="0"/>
-          <w:numId w:val="24"/>
-        </w:numPr>
-        <w:ind w:hanging="294"/>
-        <w:rPr>
-          <w:rFonts w:asciiTheme="majorHAnsi" w:hAnsiTheme="majorHAnsi"/>
-          <w:color w:val="1D1E3C" w:themeColor="text2"/>
-          <w:sz w:val="32"/>
-          <w:szCs w:val="24"/>
-        </w:rPr>
-      </w:pPr>
-      <w:r>
-        <w:rPr>
           <w:rFonts w:ascii="Calibri" w:hAnsi="Calibri"/>
-          <w:noProof/>
-          <w:color w:val="000000"/>
-          <w:sz w:val="22"/>
-          <w:lang w:eastAsia="fr-FR"/>
-        </w:rPr>
-        <mc:AlternateContent>
-          <mc:Choice Requires="wps">
-            <w:drawing>
-              <wp:anchor distT="0" distB="0" distL="114300" distR="114300" simplePos="0" relativeHeight="251657728" behindDoc="0" locked="0" layoutInCell="1" allowOverlap="1" wp14:anchorId="7DC5A4FD" wp14:editId="2143A06A">
-                <wp:simplePos x="0" y="0"/>
-                <wp:positionH relativeFrom="column">
-                  <wp:posOffset>8890</wp:posOffset>
-                </wp:positionH>
-                <wp:positionV relativeFrom="paragraph">
-                  <wp:posOffset>313690</wp:posOffset>
-                </wp:positionV>
-                <wp:extent cx="6748780" cy="0"/>
-                <wp:effectExtent l="0" t="0" r="0" b="0"/>
-                <wp:wrapNone/>
-                <wp:docPr id="12" name="Connecteur droit 12"/>
-                <wp:cNvGraphicFramePr/>
-                <a:graphic xmlns:a="http://schemas.openxmlformats.org/drawingml/2006/main">
-                  <a:graphicData uri="http://schemas.microsoft.com/office/word/2010/wordprocessingShape">
-                    <wps:wsp>
-                      <wps:cNvCnPr/>
-                      <wps:spPr>
-                        <a:xfrm>
-                          <a:off x="0" y="0"/>
-                          <a:ext cx="6748780" cy="0"/>
-                        </a:xfrm>
-                        <a:prstGeom prst="line">
-                          <a:avLst/>
-                        </a:prstGeom>
-                        <a:ln/>
-                      </wps:spPr>
-                      <wps:style>
-                        <a:lnRef idx="1">
-                          <a:schemeClr val="accent2"/>
-                        </a:lnRef>
-                        <a:fillRef idx="0">
-                          <a:schemeClr val="accent2"/>
-                        </a:fillRef>
-                        <a:effectRef idx="0">
-                          <a:schemeClr val="accent2"/>
-                        </a:effectRef>
-                        <a:fontRef idx="minor">
-                          <a:schemeClr val="tx1"/>
-                        </a:fontRef>
-                      </wps:style>
-                      <wps:bodyPr/>
-                    </wps:wsp>
-                  </a:graphicData>
-                </a:graphic>
-                <wp14:sizeRelH relativeFrom="margin">
-                  <wp14:pctWidth>0</wp14:pctWidth>
-                </wp14:sizeRelH>
-                <wp14:sizeRelV relativeFrom="margin">
-                  <wp14:pctHeight>0</wp14:pctHeight>
-                </wp14:sizeRelV>
-              </wp:anchor>
-            </w:drawing>
-          </mc:Choice>
-          <mc:Fallback>
-            <w:pict>
-              <v:line w14:anchorId="3DCA0162" id="Connecteur droit 12" o:spid="_x0000_s1026" style="position:absolute;z-index:251657728;visibility:visible;mso-wrap-style:square;mso-width-percent:0;mso-height-percent:0;mso-wrap-distance-left:9pt;mso-wrap-distance-top:0;mso-wrap-distance-right:9pt;mso-wrap-distance-bottom:0;mso-position-horizontal:absolute;mso-position-horizontal-relative:text;mso-position-vertical:absolute;mso-position-vertical-relative:text;mso-width-percent:0;mso-height-percent:0;mso-width-relative:margin;mso-height-relative:margin" from=".7pt,24.7pt" to="532.1pt,24.7pt" o:gfxdata="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" strokecolor="#8d2660 [3045]"/>
-            </w:pict>
-          </mc:Fallback>
-        </mc:AlternateContent>
-      </w:r>
-      <w:r>
-        <w:rPr>
-          <w:rFonts w:asciiTheme="majorHAnsi" w:hAnsiTheme="majorHAnsi" w:ascii="Calibri" w:hAnsi="Calibri"/>
-          <w:color w:val="000000"/>
-          <w:sz w:val="22"/>
-          <w:szCs w:val="24"/>
-        </w:rPr>
-        <w:t>PROJETS PERSONNELS ET/OU PROJETS D’</w:t>
-      </w:r>
-      <w:r>
-        <w:rPr>
-          <w:rFonts w:asciiTheme="majorHAnsi" w:hAnsiTheme="majorHAnsi" w:ascii="Calibri" w:hAnsi="Calibri"/>
-          <w:color w:val="000000"/>
-          <w:sz w:val="22"/>
-          <w:szCs w:val="24"/>
-        </w:rPr>
-        <w:t>É</w:t>
-      </w:r>
-      <w:r>
-        <w:rPr>
-          <w:rFonts w:asciiTheme="majorHAnsi" w:hAnsiTheme="majorHAnsi" w:ascii="Calibri" w:hAnsi="Calibri"/>
-          <w:color w:val="000000"/>
-          <w:sz w:val="22"/>
-          <w:szCs w:val="24"/>
-        </w:rPr>
-        <w:t>TUDES</w:t>
-      </w:r>
-    </w:p>
-    <w:p>
-      <w:pPr>
-        <w:rPr>
-          <w:rFonts w:ascii="Roboto Lt" w:hAnsi="Roboto Lt"/>
-          <w:color w:val="3750BE" w:themeColor="accent1"/>
-          <w:sz w:val="8"/>
-          <w:szCs w:val="8"/>
-        </w:rPr>
-      </w:pPr>
-    </w:p>
-    <w:p>
-      <w:pPr>
-        <w:rPr>
-          <w:rFonts w:ascii="Roboto Light" w:hAnsi="Roboto Light"/>
-          <w:color w:val="3750BE" w:themeColor="accent1"/>
-          <w:sz w:val="24"/>
-          <w:szCs w:val="24"/>
-        </w:rPr>
-      </w:pPr>
-      <w:r>
-        <w:rPr>
-          <w:rFonts w:ascii="Calibri" w:hAnsi="Calibri"/>
-          <w:b/>
-          <w:color w:val="333333"/>
-          <w:sz w:val="22"/>
-        </w:rPr>
-        <w:t>Epitech – Île-de-France</w:t>
-      </w:r>
-    </w:p>
-    <w:p>
-      <w:pPr>
-        <w:rPr>
-          <w:rFonts w:ascii="Roboto" w:hAnsi="Roboto"/>
-          <w:color w:val="3750BE" w:themeColor="accent1"/>
-          <w:sz w:val="24"/>
-          <w:szCs w:val="24"/>
-        </w:rPr>
-      </w:pPr>
-      <w:r>
-        <w:rPr>
-          <w:rFonts w:ascii="Calibri" w:hAnsi="Calibri"/>
-          <w:color w:val="000000"/>
           <w:sz w:val="22"/>
         </w:rPr>
         <w:t>Projets d'études Epitech - Cursus 5 ans par projets :</w:t>
@@ -1502,6 +495,358 @@
     </w:p>
     <w:p>
       <w:pPr>
+        <w:spacing w:line="360" w:lineRule="auto"/>
+        <w:rPr>
+          <w:rFonts w:ascii="Roboto" w:hAnsi="Roboto"/>
+          <w:color w:val="1D1E3C" w:themeColor="text2"/>
+          <w:sz w:val="24"/>
+          <w:szCs w:val="24"/>
+        </w:rPr>
+      </w:pPr>
+      <w:r>
+        <w:rPr>
+          <w:rFonts w:ascii="Calibri" w:hAnsi="Calibri"/>
+          <w:i/>
+          <w:sz w:val="20"/>
+        </w:rPr>
+        <w:t>Environnement : Terraform, AWS, kubeadm, Kubernetes, Kustomize, Docker, Linux</w:t>
+      </w:r>
+    </w:p>
+    <w:p>
+      <w:pPr>
+        <w:pStyle w:val="Paragraphedeliste"/>
+        <w:numPr>
+          <w:ilvl w:val="0"/>
+          <w:numId w:val="10"/>
+        </w:numPr>
+        <w:ind w:hanging="217"/>
+        <w:rPr>
+          <w:rFonts w:ascii="Roboto" w:hAnsi="Roboto"/>
+          <w:color w:val="4256A6"/>
+          <w:sz w:val="24"/>
+          <w:szCs w:val="24"/>
+        </w:rPr>
+      </w:pPr>
+      <w:r/>
+    </w:p>
+    <w:p>
+      <w:pPr>
+        <w:pStyle w:val="Paragraphedeliste"/>
+        <w:numPr>
+          <w:ilvl w:val="0"/>
+          <w:numId w:val="10"/>
+        </w:numPr>
+        <w:ind w:hanging="217"/>
+        <w:rPr>
+          <w:rFonts w:ascii="Roboto" w:hAnsi="Roboto"/>
+          <w:color w:val="4256A6"/>
+          <w:sz w:val="24"/>
+          <w:szCs w:val="24"/>
+        </w:rPr>
+      </w:pPr>
+      <w:r>
+        <w:rPr>
+          <w:rFonts w:ascii="Calibri" w:hAnsi="Calibri"/>
+          <w:b/>
+          <w:color w:val="003366"/>
+          <w:sz w:val="28"/>
+        </w:rPr>
+        <w:t>CERTIFICATIONS</w:t>
+      </w:r>
+    </w:p>
+    <w:p>
+      <w:pPr>
+        <w:pStyle w:val="Paragraphedeliste"/>
+        <w:numPr>
+          <w:ilvl w:val="0"/>
+          <w:numId w:val="10"/>
+        </w:numPr>
+        <w:ind w:hanging="217"/>
+        <w:rPr>
+          <w:rFonts w:ascii="Roboto" w:hAnsi="Roboto"/>
+          <w:color w:val="4256A6"/>
+          <w:sz w:val="24"/>
+          <w:szCs w:val="24"/>
+        </w:rPr>
+      </w:pPr>
+      <w:r/>
+    </w:p>
+    <w:p>
+      <w:pPr>
+        <w:pStyle w:val="Paragraphedeliste"/>
+        <w:numPr>
+          <w:ilvl w:val="0"/>
+          <w:numId w:val="10"/>
+        </w:numPr>
+        <w:ind w:hanging="217"/>
+        <w:rPr>
+          <w:rFonts w:ascii="Roboto" w:hAnsi="Roboto"/>
+          <w:color w:val="4256A6"/>
+          <w:sz w:val="24"/>
+          <w:szCs w:val="24"/>
+        </w:rPr>
+      </w:pPr>
+      <w:r>
+        <w:rPr>
+          <w:rFonts w:ascii="Calibri" w:hAnsi="Calibri"/>
+          <w:b/>
+          <w:sz w:val="22"/>
+        </w:rPr>
+        <w:t>AWS Solutions Architect – Associate</w:t>
+      </w:r>
+    </w:p>
+    <w:p>
+      <w:pPr>
+        <w:pStyle w:val="Paragraphedeliste"/>
+        <w:numPr>
+          <w:ilvl w:val="0"/>
+          <w:numId w:val="10"/>
+        </w:numPr>
+        <w:ind w:hanging="217"/>
+        <w:rPr>
+          <w:rFonts w:ascii="Roboto" w:hAnsi="Roboto"/>
+          <w:color w:val="4256A6"/>
+          <w:sz w:val="24"/>
+          <w:szCs w:val="24"/>
+        </w:rPr>
+      </w:pPr>
+      <w:r>
+        <w:rPr>
+          <w:rFonts w:ascii="Calibri" w:hAnsi="Calibri"/>
+          <w:i/>
+          <w:sz w:val="20"/>
+        </w:rPr>
+        <w:t>Amazon Web Services</w:t>
+      </w:r>
+    </w:p>
+    <w:p>
+      <w:pPr>
+        <w:rPr>
+          <w:rFonts w:ascii="Roboto" w:hAnsi="Roboto"/>
+          <w:sz w:val="24"/>
+          <w:szCs w:val="24"/>
+        </w:rPr>
+      </w:pPr>
+      <w:r/>
+    </w:p>
+    <w:p>
+      <w:pPr>
+        <w:rPr>
+          <w:rFonts w:ascii="Roboto" w:hAnsi="Roboto"/>
+          <w:color w:val="313366" w:themeColor="text1" w:themeTint="D9"/>
+          <w:sz w:val="24"/>
+          <w:szCs w:val="24"/>
+        </w:rPr>
+      </w:pPr>
+      <w:r>
+        <w:rPr>
+          <w:rFonts w:ascii="Calibri" w:hAnsi="Calibri"/>
+          <w:b/>
+          <w:sz w:val="22"/>
+        </w:rPr>
+        <w:t>Terraform Associate (003)</w:t>
+      </w:r>
+    </w:p>
+    <w:p>
+      <w:pPr>
+        <w:spacing w:line="360" w:lineRule="auto"/>
+        <w:rPr>
+          <w:color w:val="1D1E3C" w:themeColor="text2"/>
+          <w:sz w:val="24"/>
+          <w:szCs w:val="24"/>
+        </w:rPr>
+      </w:pPr>
+      <w:r>
+        <w:rPr>
+          <w:rFonts w:ascii="Calibri" w:hAnsi="Calibri"/>
+          <w:i/>
+          <w:sz w:val="20"/>
+        </w:rPr>
+        <w:t>HashiCorp</w:t>
+      </w:r>
+    </w:p>
+    <w:p>
+      <w:pPr>
+        <w:pStyle w:val="Paragraphedeliste"/>
+        <w:numPr>
+          <w:ilvl w:val="0"/>
+          <w:numId w:val="10"/>
+        </w:numPr>
+        <w:ind w:hanging="218"/>
+        <w:rPr>
+          <w:rFonts w:ascii="Roboto" w:hAnsi="Roboto"/>
+          <w:color w:val="4256A6"/>
+          <w:sz w:val="24"/>
+          <w:szCs w:val="24"/>
+        </w:rPr>
+      </w:pPr>
+      <w:r/>
+    </w:p>
+    <w:p>
+      <w:pPr>
+        <w:pStyle w:val="Paragraphedeliste"/>
+        <w:numPr>
+          <w:ilvl w:val="0"/>
+          <w:numId w:val="10"/>
+        </w:numPr>
+        <w:ind w:hanging="218"/>
+        <w:rPr>
+          <w:rFonts w:ascii="Roboto" w:hAnsi="Roboto"/>
+          <w:color w:val="4256A6"/>
+          <w:sz w:val="24"/>
+          <w:szCs w:val="24"/>
+        </w:rPr>
+      </w:pPr>
+      <w:r>
+        <w:rPr>
+          <w:rFonts w:ascii="Calibri" w:hAnsi="Calibri"/>
+          <w:b/>
+          <w:color w:val="003366"/>
+          <w:sz w:val="28"/>
+        </w:rPr>
+        <w:t>FORMATION</w:t>
+      </w:r>
+    </w:p>
+    <w:p>
+      <w:pPr>
+        <w:pStyle w:val="Paragraphedeliste"/>
+        <w:numPr>
+          <w:ilvl w:val="0"/>
+          <w:numId w:val="10"/>
+        </w:numPr>
+        <w:ind w:hanging="218"/>
+        <w:rPr>
+          <w:rFonts w:ascii="Roboto" w:hAnsi="Roboto"/>
+          <w:color w:val="4256A6"/>
+          <w:sz w:val="24"/>
+          <w:szCs w:val="24"/>
+        </w:rPr>
+      </w:pPr>
+      <w:r/>
+    </w:p>
+    <w:p>
+      <w:pPr>
+        <w:pStyle w:val="Paragraphedeliste"/>
+        <w:numPr>
+          <w:ilvl w:val="0"/>
+          <w:numId w:val="10"/>
+        </w:numPr>
+        <w:ind w:hanging="218"/>
+        <w:rPr>
+          <w:rFonts w:ascii="Roboto" w:hAnsi="Roboto"/>
+          <w:color w:val="4256A6"/>
+          <w:sz w:val="24"/>
+          <w:szCs w:val="24"/>
+        </w:rPr>
+      </w:pPr>
+      <w:r>
+        <w:rPr>
+          <w:rFonts w:ascii="Calibri" w:hAnsi="Calibri"/>
+          <w:b/>
+          <w:sz w:val="22"/>
+        </w:rPr>
+        <w:t>Master informatique (Titre RNCP niveau 7) - 2022</w:t>
+      </w:r>
+    </w:p>
+    <w:p>
+      <w:pPr>
+        <w:pStyle w:val="Paragraphedeliste"/>
+        <w:numPr>
+          <w:ilvl w:val="0"/>
+          <w:numId w:val="10"/>
+        </w:numPr>
+        <w:ind w:hanging="218"/>
+        <w:rPr>
+          <w:rFonts w:ascii="Roboto" w:hAnsi="Roboto"/>
+          <w:sz w:val="24"/>
+          <w:szCs w:val="24"/>
+        </w:rPr>
+      </w:pPr>
+      <w:r>
+        <w:rPr>
+          <w:rFonts w:ascii="Calibri" w:hAnsi="Calibri"/>
+          <w:sz w:val="22"/>
+        </w:rPr>
+        <w:t>Epitech - Île-de-France</w:t>
+      </w:r>
+    </w:p>
+    <w:p>
+      <w:pPr>
+        <w:rPr>
+          <w:rFonts w:ascii="Roboto" w:hAnsi="Roboto"/>
+          <w:sz w:val="24"/>
+          <w:szCs w:val="24"/>
+        </w:rPr>
+      </w:pPr>
+    </w:p>
+    <w:p>
+      <w:pPr>
+        <w:rPr>
+          <w:rFonts w:asciiTheme="majorHAnsi" w:hAnsiTheme="majorHAnsi"/>
+          <w:color w:val="3750BE" w:themeColor="accent1"/>
+          <w:sz w:val="28"/>
+          <w:szCs w:val="44"/>
+        </w:rPr>
+      </w:pPr>
+    </w:p>
+    <w:p>
+      <w:pPr>
+        <w:spacing w:after="0"/>
+        <w:rPr>
+          <w:rFonts w:asciiTheme="majorHAnsi" w:hAnsiTheme="majorHAnsi"/>
+          <w:color w:val="3750BE" w:themeColor="accent1"/>
+          <w:szCs w:val="36"/>
+        </w:rPr>
+      </w:pPr>
+    </w:p>
+    <w:p>
+      <w:pPr>
+        <w:pStyle w:val="Paragraphedeliste"/>
+        <w:numPr>
+          <w:ilvl w:val="0"/>
+          <w:numId w:val="24"/>
+        </w:numPr>
+        <w:ind w:hanging="294"/>
+        <w:rPr>
+          <w:rFonts w:asciiTheme="majorHAnsi" w:hAnsiTheme="majorHAnsi"/>
+          <w:color w:val="1D1E3C" w:themeColor="text2"/>
+          <w:sz w:val="32"/>
+          <w:szCs w:val="24"/>
+        </w:rPr>
+      </w:pPr>
+    </w:p>
+    <w:p>
+      <w:pPr>
+        <w:rPr>
+          <w:rFonts w:ascii="Roboto Lt" w:hAnsi="Roboto Lt"/>
+          <w:color w:val="3750BE" w:themeColor="accent1"/>
+          <w:sz w:val="8"/>
+          <w:szCs w:val="8"/>
+        </w:rPr>
+      </w:pPr>
+    </w:p>
+    <w:p>
+      <w:pPr>
+        <w:rPr>
+          <w:rFonts w:ascii="Roboto Light" w:hAnsi="Roboto Light"/>
+          <w:color w:val="3750BE" w:themeColor="accent1"/>
+          <w:sz w:val="24"/>
+          <w:szCs w:val="24"/>
+        </w:rPr>
+      </w:pPr>
+    </w:p>
+    <w:p>
+      <w:pPr>
+        <w:rPr>
+          <w:rFonts w:ascii="Roboto" w:hAnsi="Roboto"/>
+          <w:color w:val="3750BE" w:themeColor="accent1"/>
+          <w:sz w:val="24"/>
+          <w:szCs w:val="24"/>
+        </w:rPr>
+      </w:pPr>
+    </w:p>
+    <w:p>
+      <w:pPr>
         <w:pStyle w:val="Paragraphedeliste"/>
         <w:numPr>
           <w:ilvl w:val="0"/>
@@ -1515,15 +860,6 @@
           <w:szCs w:val="24"/>
         </w:rPr>
       </w:pPr>
-      <w:r>
-        <w:rPr>
-          <w:rFonts w:ascii="Calibri" w:hAnsi="Calibri"/>
-          <w:i/>
-          <w:color w:val="000000"/>
-          <w:sz w:val="20"/>
-        </w:rPr>
-        <w:t>Environnement : Terraform, AWS, kubeadm, Kubernetes, Kustomize, Docker, Linux</w:t>
-      </w:r>
     </w:p>
     <w:p>
       <w:pPr>
@@ -1581,7 +917,6 @@
           <w:szCs w:val="24"/>
         </w:rPr>
       </w:pPr>
-      <w:r/>
     </w:p>
     <w:p>
       <w:pPr>
@@ -1601,7 +936,6 @@
           <w:szCs w:val="24"/>
         </w:rPr>
       </w:pPr>
-      <w:r/>
     </w:p>
     <w:p>
       <w:pPr>
@@ -1612,7 +946,6 @@
           <w:szCs w:val="24"/>
         </w:rPr>
       </w:pPr>
-      <w:r/>
     </w:p>
     <w:p>
       <w:pPr>
@@ -1688,7 +1021,6 @@
           <w:szCs w:val="24"/>
         </w:rPr>
       </w:pPr>
-      <w:r/>
     </w:p>
     <w:p>
       <w:pPr>
@@ -1699,77 +1031,6 @@
           <w:szCs w:val="24"/>
         </w:rPr>
       </w:pPr>
-      <w:r>
-        <w:rPr>
-          <w:rFonts w:asciiTheme="majorHAnsi" w:hAnsiTheme="majorHAnsi"/>
-          <w:noProof/>
-          <w:color w:val="1D1E3C" w:themeColor="text1"/>
-          <w:sz w:val="32"/>
-          <w:szCs w:val="32"/>
-        </w:rPr>
-        <w:drawing>
-          <wp:anchor distT="0" distB="0" distL="114300" distR="114300" simplePos="0" relativeHeight="251690496" behindDoc="0" locked="0" layoutInCell="1" allowOverlap="1" wp14:anchorId="2A55DE23" wp14:editId="3AC649A9">
-            <wp:simplePos x="0" y="0"/>
-            <wp:positionH relativeFrom="margin">
-              <wp:posOffset>5993130</wp:posOffset>
-            </wp:positionH>
-            <wp:positionV relativeFrom="paragraph">
-              <wp:posOffset>80645</wp:posOffset>
-            </wp:positionV>
-            <wp:extent cx="652780" cy="652780"/>
-            <wp:effectExtent l="0" t="0" r="0" b="0"/>
-            <wp:wrapSquare wrapText="bothSides"/>
-            <wp:docPr id="10" name="Image 10"/>
-            <wp:cNvGraphicFramePr>
-              <a:graphicFrameLocks xmlns:a="http://schemas.openxmlformats.org/drawingml/2006/main" noChangeAspect="1"/>
-            </wp:cNvGraphicFramePr>
-            <a:graphic xmlns:a="http://schemas.openxmlformats.org/drawingml/2006/main">
-              <a:graphicData uri="http://schemas.openxmlformats.org/drawingml/2006/picture">
-                <pic:pic xmlns:pic="http://schemas.openxmlformats.org/drawingml/2006/picture">
-                  <pic:nvPicPr>
-                    <pic:cNvPr id="0" name="Picture 7"/>
-                    <pic:cNvPicPr>
-                      <a:picLocks noChangeAspect="1" noChangeArrowheads="1"/>
-                    </pic:cNvPicPr>
-                  </pic:nvPicPr>
-                  <pic:blipFill>
-                    <a:blip r:embed="rId12" cstate="print">
-                      <a:extLst>
-                        <a:ext uri="{28A0092B-C50C-407E-A947-70E740481C1C}">
-                          <a14:useLocalDpi xmlns:a14="http://schemas.microsoft.com/office/drawing/2010/main" val="0"/>
-                        </a:ext>
-                      </a:extLst>
-                    </a:blip>
-                    <a:srcRect/>
-                    <a:stretch>
-                      <a:fillRect/>
-                    </a:stretch>
-                  </pic:blipFill>
-                  <pic:spPr bwMode="auto">
-                    <a:xfrm>
-                      <a:off x="0" y="0"/>
-                      <a:ext cx="652780" cy="652780"/>
-                    </a:xfrm>
-                    <a:prstGeom prst="rect">
-                      <a:avLst/>
-                    </a:prstGeom>
-                    <a:noFill/>
-                    <a:ln>
-                      <a:noFill/>
-                    </a:ln>
-                  </pic:spPr>
-                </pic:pic>
-              </a:graphicData>
-            </a:graphic>
-            <wp14:sizeRelH relativeFrom="margin">
-              <wp14:pctWidth>0</wp14:pctWidth>
-            </wp14:sizeRelH>
-            <wp14:sizeRelV relativeFrom="margin">
-              <wp14:pctHeight>0</wp14:pctHeight>
-            </wp14:sizeRelV>
-          </wp:anchor>
-        </w:drawing>
-      </w:r>
     </w:p>
     <w:p>
       <w:pPr>
@@ -1787,90 +1048,6 @@
           <w:szCs w:val="28"/>
         </w:rPr>
       </w:pPr>
-      <w:r>
-        <w:rPr>
-          <w:rFonts w:asciiTheme="majorHAnsi" w:hAnsiTheme="majorHAnsi" w:ascii="Calibri" w:hAnsi="Calibri"/>
-          <w:b/>
-          <w:color w:val="003366"/>
-          <w:sz w:val="28"/>
-          <w:szCs w:val="32"/>
-        </w:rPr>
-        <w:t>FORMATION</w:t>
-      </w:r>
-      <w:r>
-        <w:rPr>
-          <w:rFonts w:ascii="Calibri" w:hAnsi="Calibri"/>
-          <w:b/>
-          <w:noProof/>
-          <w:color w:val="003366"/>
-          <w:sz w:val="28"/>
-          <w:szCs w:val="28"/>
-          <w:lang w:eastAsia="fr-FR"/>
-        </w:rPr>
-        <mc:AlternateContent>
-          <mc:Choice Requires="wps">
-            <w:drawing>
-              <wp:anchor distT="0" distB="0" distL="114300" distR="114300" simplePos="0" relativeHeight="251679232" behindDoc="0" locked="0" layoutInCell="1" allowOverlap="1" wp14:anchorId="2DB9C928" wp14:editId="4B66CFF5">
-                <wp:simplePos x="0" y="0"/>
-                <wp:positionH relativeFrom="column">
-                  <wp:posOffset>8890</wp:posOffset>
-                </wp:positionH>
-                <wp:positionV relativeFrom="paragraph">
-                  <wp:posOffset>313372</wp:posOffset>
-                </wp:positionV>
-                <wp:extent cx="6748780" cy="0"/>
-                <wp:effectExtent l="0" t="0" r="0" b="0"/>
-                <wp:wrapNone/>
-                <wp:docPr id="11" name="Connecteur droit 11"/>
-                <wp:cNvGraphicFramePr/>
-                <a:graphic xmlns:a="http://schemas.openxmlformats.org/drawingml/2006/main">
-                  <a:graphicData uri="http://schemas.microsoft.com/office/word/2010/wordprocessingShape">
-                    <wps:wsp>
-                      <wps:cNvCnPr/>
-                      <wps:spPr>
-                        <a:xfrm>
-                          <a:off x="0" y="0"/>
-                          <a:ext cx="6748780" cy="0"/>
-                        </a:xfrm>
-                        <a:prstGeom prst="line">
-                          <a:avLst/>
-                        </a:prstGeom>
-                        <a:ln/>
-                      </wps:spPr>
-                      <wps:style>
-                        <a:lnRef idx="1">
-                          <a:schemeClr val="accent2"/>
-                        </a:lnRef>
-                        <a:fillRef idx="0">
-                          <a:schemeClr val="accent2"/>
-                        </a:fillRef>
-                        <a:effectRef idx="0">
-                          <a:schemeClr val="accent2"/>
-                        </a:effectRef>
-                        <a:fontRef idx="minor">
-                          <a:schemeClr val="tx1"/>
-                        </a:fontRef>
-                      </wps:style>
-                      <wps:bodyPr/>
-                    </wps:wsp>
-                  </a:graphicData>
-                </a:graphic>
-                <wp14:sizeRelH relativeFrom="margin">
-                  <wp14:pctWidth>0</wp14:pctWidth>
-                </wp14:sizeRelH>
-                <wp14:sizeRelV relativeFrom="margin">
-                  <wp14:pctHeight>0</wp14:pctHeight>
-                </wp14:sizeRelV>
-              </wp:anchor>
-            </w:drawing>
-          </mc:Choice>
-          <mc:Fallback>
-            <w:pict>
-              <v:line w14:anchorId="653DCD9B" id="Connecteur droit 11" o:spid="_x0000_s1026" style="position:absolute;z-index:251679232;visibility:visible;mso-wrap-style:square;mso-width-percent:0;mso-height-percent:0;mso-wrap-distance-left:9pt;mso-wrap-distance-top:0;mso-wrap-distance-right:9pt;mso-wrap-distance-bottom:0;mso-position-horizontal:absolute;mso-position-horizontal-relative:text;mso-position-vertical:absolute;mso-position-vertical-relative:text;mso-width-percent:0;mso-height-percent:0;mso-width-relative:margin;mso-height-relative:margin" from=".7pt,24.65pt" to="532.1pt,24.65pt" o:gfxdata="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" strokecolor="#8d2660 [3045]"/>
-            </w:pict>
-          </mc:Fallback>
-        </mc:AlternateContent>
-      </w:r>
     </w:p>
     <w:p>
       <w:pPr>
@@ -1893,15 +1070,6 @@
           <w:szCs w:val="24"/>
         </w:rPr>
       </w:pPr>
-      <w:r>
-        <w:rPr>
-          <w:rFonts w:ascii="Calibri" w:hAnsi="Calibri"/>
-          <w:b/>
-          <w:color w:val="333333"/>
-          <w:sz w:val="22"/>
-        </w:rPr>
-        <w:t>Master informatique (Titre RNCP niveau 7) - 2022</w:t>
-      </w:r>
     </w:p>
     <w:p>
       <w:pPr>
@@ -1913,14 +1081,6 @@
           <w:szCs w:val="24"/>
         </w:rPr>
       </w:pPr>
-      <w:r>
-        <w:rPr>
-          <w:rFonts w:ascii="Calibri" w:hAnsi="Calibri"/>
-          <w:color w:val="000000"/>
-          <w:sz w:val="22"/>
-        </w:rPr>
-        <w:t>Epitech - Île-de-France</w:t>
-      </w:r>
     </w:p>
     <w:p>
       <w:pPr>
@@ -1932,7 +1092,6 @@
           <w:szCs w:val="20"/>
         </w:rPr>
       </w:pPr>
-      <w:r/>
     </w:p>
     <w:p>
       <w:pPr>
@@ -1944,7 +1103,17 @@
           <w:szCs w:val="24"/>
         </w:rPr>
       </w:pPr>
-      <w:r/>
+    </w:p>
+    <w:p>
+      <w:pPr>
+        <w:spacing w:line="240" w:lineRule="auto"/>
+        <w:rPr>
+          <w:rFonts w:ascii="Roboto" w:hAnsi="Roboto"/>
+          <w:color w:val="3750BE" w:themeColor="accent1"/>
+          <w:sz w:val="24"/>
+          <w:szCs w:val="24"/>
+        </w:rPr>
+      </w:pPr>
     </w:p>
     <w:sectPr>
       <w:headerReference w:type="default" r:id="rId13"/>

</xml_diff>

<commit_message>
Optimisation de l'espace - suppression du blanc inutile en bas
Co-authored-by: Curtis736 <Curtis736@users.noreply.github.com>
</commit_message>
<xml_diff>
--- a/CV_Curtis_Robert_CELAD.docx
+++ b/CV_Curtis_Robert_CELAD.docx
@@ -772,329 +772,6 @@
     </w:p>
     <w:p>
       <w:pPr>
-        <w:rPr>
-          <w:rFonts w:ascii="Roboto" w:hAnsi="Roboto"/>
-          <w:sz w:val="24"/>
-          <w:szCs w:val="24"/>
-        </w:rPr>
-      </w:pPr>
-    </w:p>
-    <w:p>
-      <w:pPr>
-        <w:rPr>
-          <w:rFonts w:asciiTheme="majorHAnsi" w:hAnsiTheme="majorHAnsi"/>
-          <w:color w:val="3750BE" w:themeColor="accent1"/>
-          <w:sz w:val="28"/>
-          <w:szCs w:val="44"/>
-        </w:rPr>
-      </w:pPr>
-    </w:p>
-    <w:p>
-      <w:pPr>
-        <w:spacing w:after="0"/>
-        <w:rPr>
-          <w:rFonts w:asciiTheme="majorHAnsi" w:hAnsiTheme="majorHAnsi"/>
-          <w:color w:val="3750BE" w:themeColor="accent1"/>
-          <w:szCs w:val="36"/>
-        </w:rPr>
-      </w:pPr>
-    </w:p>
-    <w:p>
-      <w:pPr>
-        <w:pStyle w:val="Paragraphedeliste"/>
-        <w:numPr>
-          <w:ilvl w:val="0"/>
-          <w:numId w:val="24"/>
-        </w:numPr>
-        <w:ind w:hanging="294"/>
-        <w:rPr>
-          <w:rFonts w:asciiTheme="majorHAnsi" w:hAnsiTheme="majorHAnsi"/>
-          <w:color w:val="1D1E3C" w:themeColor="text2"/>
-          <w:sz w:val="32"/>
-          <w:szCs w:val="24"/>
-        </w:rPr>
-      </w:pPr>
-    </w:p>
-    <w:p>
-      <w:pPr>
-        <w:rPr>
-          <w:rFonts w:ascii="Roboto Lt" w:hAnsi="Roboto Lt"/>
-          <w:color w:val="3750BE" w:themeColor="accent1"/>
-          <w:sz w:val="8"/>
-          <w:szCs w:val="8"/>
-        </w:rPr>
-      </w:pPr>
-    </w:p>
-    <w:p>
-      <w:pPr>
-        <w:rPr>
-          <w:rFonts w:ascii="Roboto Light" w:hAnsi="Roboto Light"/>
-          <w:color w:val="3750BE" w:themeColor="accent1"/>
-          <w:sz w:val="24"/>
-          <w:szCs w:val="24"/>
-        </w:rPr>
-      </w:pPr>
-    </w:p>
-    <w:p>
-      <w:pPr>
-        <w:rPr>
-          <w:rFonts w:ascii="Roboto" w:hAnsi="Roboto"/>
-          <w:color w:val="3750BE" w:themeColor="accent1"/>
-          <w:sz w:val="24"/>
-          <w:szCs w:val="24"/>
-        </w:rPr>
-      </w:pPr>
-    </w:p>
-    <w:p>
-      <w:pPr>
-        <w:pStyle w:val="Paragraphedeliste"/>
-        <w:numPr>
-          <w:ilvl w:val="0"/>
-          <w:numId w:val="6"/>
-        </w:numPr>
-        <w:ind w:hanging="75"/>
-        <w:rPr>
-          <w:rFonts w:ascii="Roboto" w:hAnsi="Roboto"/>
-          <w:color w:val="4256A6"/>
-          <w:sz w:val="24"/>
-          <w:szCs w:val="24"/>
-        </w:rPr>
-      </w:pPr>
-    </w:p>
-    <w:p>
-      <w:pPr>
-        <w:pStyle w:val="Paragraphedeliste"/>
-        <w:numPr>
-          <w:ilvl w:val="0"/>
-          <w:numId w:val="6"/>
-        </w:numPr>
-        <w:ind w:hanging="75"/>
-        <w:rPr>
-          <w:rFonts w:ascii="Roboto" w:hAnsi="Roboto"/>
-          <w:color w:val="4256A6"/>
-          <w:sz w:val="24"/>
-          <w:szCs w:val="24"/>
-        </w:rPr>
-      </w:pPr>
-    </w:p>
-    <w:p>
-      <w:pPr>
-        <w:pStyle w:val="Paragraphedeliste"/>
-        <w:numPr>
-          <w:ilvl w:val="0"/>
-          <w:numId w:val="6"/>
-        </w:numPr>
-        <w:ind w:hanging="75"/>
-        <w:rPr>
-          <w:rFonts w:ascii="Roboto" w:hAnsi="Roboto"/>
-          <w:color w:val="4256A6"/>
-          <w:sz w:val="24"/>
-          <w:szCs w:val="24"/>
-        </w:rPr>
-      </w:pPr>
-    </w:p>
-    <w:p>
-      <w:pPr>
-        <w:pStyle w:val="Paragraphedeliste"/>
-        <w:numPr>
-          <w:ilvl w:val="0"/>
-          <w:numId w:val="6"/>
-        </w:numPr>
-        <w:ind w:hanging="75"/>
-        <w:rPr>
-          <w:rFonts w:ascii="Roboto" w:hAnsi="Roboto"/>
-          <w:color w:val="4256A6"/>
-          <w:sz w:val="24"/>
-          <w:szCs w:val="24"/>
-        </w:rPr>
-      </w:pPr>
-    </w:p>
-    <w:p>
-      <w:pPr>
-        <w:rPr>
-          <w:rFonts w:ascii="Roboto" w:hAnsi="Roboto"/>
-          <w:sz w:val="24"/>
-          <w:szCs w:val="24"/>
-        </w:rPr>
-      </w:pPr>
-    </w:p>
-    <w:p>
-      <w:pPr>
-        <w:rPr>
-          <w:rFonts w:ascii="Roboto" w:hAnsi="Roboto"/>
-          <w:sz w:val="24"/>
-          <w:szCs w:val="24"/>
-        </w:rPr>
-      </w:pPr>
-    </w:p>
-    <w:p>
-      <w:pPr>
-        <w:rPr>
-          <w:rFonts w:ascii="Roboto Light" w:hAnsi="Roboto Light"/>
-          <w:color w:val="3750BE" w:themeColor="accent1"/>
-          <w:sz w:val="24"/>
-          <w:szCs w:val="24"/>
-        </w:rPr>
-      </w:pPr>
-    </w:p>
-    <w:p>
-      <w:pPr>
-        <w:rPr>
-          <w:rFonts w:ascii="Roboto" w:hAnsi="Roboto"/>
-          <w:color w:val="1D1E3C" w:themeColor="text2"/>
-          <w:sz w:val="24"/>
-          <w:szCs w:val="24"/>
-        </w:rPr>
-      </w:pPr>
-    </w:p>
-    <w:p>
-      <w:pPr>
-        <w:pStyle w:val="Paragraphedeliste"/>
-        <w:numPr>
-          <w:ilvl w:val="0"/>
-          <w:numId w:val="12"/>
-        </w:numPr>
-        <w:ind w:hanging="75"/>
-        <w:rPr>
-          <w:rFonts w:ascii="Roboto" w:hAnsi="Roboto"/>
-          <w:color w:val="4256A6"/>
-          <w:sz w:val="24"/>
-          <w:szCs w:val="24"/>
-        </w:rPr>
-      </w:pPr>
-    </w:p>
-    <w:p>
-      <w:pPr>
-        <w:pStyle w:val="Paragraphedeliste"/>
-        <w:numPr>
-          <w:ilvl w:val="0"/>
-          <w:numId w:val="12"/>
-        </w:numPr>
-        <w:ind w:hanging="75"/>
-        <w:rPr>
-          <w:rFonts w:ascii="Roboto" w:hAnsi="Roboto"/>
-          <w:b/>
-          <w:bCs/>
-          <w:color w:val="4256A6"/>
-          <w:sz w:val="24"/>
-          <w:szCs w:val="24"/>
-        </w:rPr>
-      </w:pPr>
-    </w:p>
-    <w:p>
-      <w:pPr>
-        <w:pStyle w:val="Paragraphedeliste"/>
-        <w:numPr>
-          <w:ilvl w:val="0"/>
-          <w:numId w:val="12"/>
-        </w:numPr>
-        <w:ind w:hanging="75"/>
-        <w:rPr>
-          <w:rFonts w:ascii="Roboto" w:hAnsi="Roboto"/>
-          <w:color w:val="4256A6"/>
-          <w:sz w:val="24"/>
-          <w:szCs w:val="24"/>
-        </w:rPr>
-      </w:pPr>
-    </w:p>
-    <w:p>
-      <w:pPr>
-        <w:pStyle w:val="Paragraphedeliste"/>
-        <w:numPr>
-          <w:ilvl w:val="0"/>
-          <w:numId w:val="12"/>
-        </w:numPr>
-        <w:ind w:hanging="75"/>
-        <w:rPr>
-          <w:rFonts w:ascii="Roboto" w:hAnsi="Roboto"/>
-          <w:color w:val="4256A6"/>
-          <w:sz w:val="24"/>
-          <w:szCs w:val="24"/>
-        </w:rPr>
-      </w:pPr>
-    </w:p>
-    <w:p>
-      <w:pPr>
-        <w:rPr>
-          <w:rFonts w:ascii="Roboto" w:hAnsi="Roboto"/>
-          <w:sz w:val="24"/>
-          <w:szCs w:val="24"/>
-        </w:rPr>
-      </w:pPr>
-    </w:p>
-    <w:p>
-      <w:pPr>
-        <w:rPr>
-          <w:rFonts w:ascii="Roboto" w:hAnsi="Roboto"/>
-          <w:color w:val="1D1E3C" w:themeColor="text2"/>
-          <w:sz w:val="24"/>
-          <w:szCs w:val="24"/>
-        </w:rPr>
-      </w:pPr>
-    </w:p>
-    <w:p>
-      <w:pPr>
-        <w:pStyle w:val="Paragraphedeliste"/>
-        <w:numPr>
-          <w:ilvl w:val="0"/>
-          <w:numId w:val="24"/>
-        </w:numPr>
-        <w:spacing w:line="240" w:lineRule="auto"/>
-        <w:ind w:hanging="294"/>
-        <w:rPr>
-          <w:rFonts w:ascii="Roboto" w:hAnsi="Roboto"/>
-          <w:color w:val="1D1E3C" w:themeColor="text2"/>
-          <w:sz w:val="36"/>
-          <w:szCs w:val="28"/>
-        </w:rPr>
-      </w:pPr>
-    </w:p>
-    <w:p>
-      <w:pPr>
-        <w:spacing w:line="240" w:lineRule="auto"/>
-        <w:rPr>
-          <w:rFonts w:ascii="Roboto Lt" w:hAnsi="Roboto Lt"/>
-          <w:color w:val="1D1E3C" w:themeColor="text1"/>
-          <w:sz w:val="8"/>
-          <w:szCs w:val="8"/>
-        </w:rPr>
-      </w:pPr>
-    </w:p>
-    <w:p>
-      <w:pPr>
-        <w:spacing w:line="240" w:lineRule="auto"/>
-        <w:rPr>
-          <w:rFonts w:ascii="Roboto Light" w:hAnsi="Roboto Light"/>
-          <w:color w:val="1D1E3C" w:themeColor="text1"/>
-          <w:sz w:val="24"/>
-          <w:szCs w:val="24"/>
-        </w:rPr>
-      </w:pPr>
-    </w:p>
-    <w:p>
-      <w:pPr>
-        <w:spacing w:line="240" w:lineRule="auto"/>
-        <w:rPr>
-          <w:rFonts w:ascii="Roboto" w:hAnsi="Roboto"/>
-          <w:color w:val="3750BE" w:themeColor="accent1"/>
-          <w:sz w:val="24"/>
-          <w:szCs w:val="24"/>
-        </w:rPr>
-      </w:pPr>
-    </w:p>
-    <w:p>
-      <w:pPr>
-        <w:spacing w:line="240" w:lineRule="auto"/>
-        <w:rPr>
-          <w:rFonts w:ascii="Roboto" w:hAnsi="Roboto"/>
-          <w:color w:val="1D1E3C" w:themeColor="accent6"/>
-          <w:sz w:val="20"/>
-          <w:szCs w:val="20"/>
-        </w:rPr>
-      </w:pPr>
-    </w:p>
-    <w:p>
-      <w:pPr>
         <w:spacing w:line="240" w:lineRule="auto"/>
         <w:rPr>
           <w:rFonts w:ascii="Roboto Light" w:hAnsi="Roboto Light"/>
@@ -1121,7 +798,7 @@
       <w:headerReference w:type="first" r:id="rId15"/>
       <w:footerReference w:type="first" r:id="rId16"/>
       <w:pgSz w:w="11906" w:h="16838"/>
-      <w:pgMar w:top="1152" w:right="1152" w:bottom="1152" w:left="1152" w:header="510" w:footer="283" w:gutter="0"/>
+      <w:pgMar w:top="864" w:right="1008" w:bottom="864" w:left="1008" w:header="510" w:footer="283" w:gutter="0"/>
       <w:cols w:space="708"/>
       <w:titlePg/>
       <w:docGrid w:linePitch="360"/>

</xml_diff>